<commit_message>
Revisión correctiva 28/10/2026: código real de Eventos Nova en el paquete, corrección U5-H1, matrices y evidencias actualizadas, bitácora y guía de pendientes DOCX
Co-Authored-By: Claude Opus 5.5 <noreply@anthropic.com>
Claude-Session: https://claude.ai/code/session_014R8LL472jMNbV2kkCjCFSj
</commit_message>
<xml_diff>
--- a/docs/REPORTE_ACTIVIDAD5.docx
+++ b/docs/REPORTE_ACTIVIDAD5.docx
@@ -452,7 +452,7 @@
                 <w:sz w:val="20"/>
                 <w:szCs w:val="20"/>
               </w:rPr>
-              <w:t>: 27/10/2026</w:t>
+              <w:t>: 27/10/2026 (revisión: 28/10/2026)</w:t>
             </w:r>
           </w:p>
         </w:tc>
@@ -1058,6 +1058,31 @@
       </w:r>
       <w:r>
         <w:t xml:space="preserve"> del entregable. Las pruebas se ejecutaron el 27/10/2026 en un entorno Linux con Python 3.13.18; para Eventos Nova se usó además una base PostgreSQL 16 local y efímera. Lo que depende de GitHub (las ejecuciones reales del pipeline) quedó preparado y se marca como pendiente.</w:t>
+      </w:r>
+    </w:p>
+    <w:p>
+      <w:pPr>
+        <w:spacing w:before="0" w:after="120" w:line="276" w:lineRule="auto"/>
+        <w:jc w:val="both"/>
+      </w:pPr>
+      <w:r>
+        <w:rPr>
+          <w:b/>
+        </w:rPr>
+        <w:t>Revisión del 28/10/2026.</w:t>
+      </w:r>
+      <w:r>
+        <w:t xml:space="preserve"> Una revisión técnica de la primera entrega encontró que las pruebas de Eventos Nova no se podían ejecutar desde el ZIP (</w:t>
+      </w:r>
+      <w:r>
+        <w:rPr>
+          <w:rFonts w:ascii="Consolas" w:hAnsi="Consolas" w:eastAsia="Consolas"/>
+          <w:sz w:val="18"/>
+        </w:rPr>
+        <w:t>ModuleNotFoundError: No module named 'domain'</w:t>
+      </w:r>
+      <w:r>
+        <w:t>). En la segunda sesión reproducimos el error, encontramos la causa (el paquete no incluía el código del PIA), integramos el código real, corregimos el hallazgo U5-H1 y volvimos a ejecutar todo. Los registros del 27/10 se conservan sin cambios; los nuevos llevan la fecha 20261028 en el nombre. Las cifras de este reporte corresponden a la ejecución final del 28/10/2026.</w:t>
       </w:r>
     </w:p>
     <w:p>
@@ -1508,7 +1533,7 @@
             <w:r>
               <w:rPr>
                 <w:rFonts w:ascii="Consolas" w:hAnsi="Consolas" w:eastAsia="Consolas"/>
-                <w:sz w:val="18"/>
+                <w:sz w:val="17"/>
               </w:rPr>
               <w:t>pytest</w:t>
             </w:r>
@@ -1521,7 +1546,7 @@
             <w:r>
               <w:rPr>
                 <w:rFonts w:ascii="Consolas" w:hAnsi="Consolas" w:eastAsia="Consolas"/>
-                <w:sz w:val="18"/>
+                <w:sz w:val="17"/>
               </w:rPr>
               <w:t>python -m</w:t>
             </w:r>
@@ -1534,7 +1559,7 @@
             <w:r>
               <w:rPr>
                 <w:rFonts w:ascii="Consolas" w:hAnsi="Consolas" w:eastAsia="Consolas"/>
-                <w:sz w:val="18"/>
+                <w:sz w:val="17"/>
               </w:rPr>
               <w:t>ModuleNotFoundError: src</w:t>
             </w:r>
@@ -1547,7 +1572,7 @@
             <w:r>
               <w:rPr>
                 <w:rFonts w:ascii="Consolas" w:hAnsi="Consolas" w:eastAsia="Consolas"/>
-                <w:sz w:val="18"/>
+                <w:sz w:val="17"/>
               </w:rPr>
               <w:t>ruff&gt;=0.6</w:t>
             </w:r>
@@ -1560,7 +1585,7 @@
             <w:r>
               <w:rPr>
                 <w:rFonts w:ascii="Consolas" w:hAnsi="Consolas" w:eastAsia="Consolas"/>
-                <w:sz w:val="18"/>
+                <w:sz w:val="17"/>
               </w:rPr>
               <w:t>ResourceWarning</w:t>
             </w:r>
@@ -1608,7 +1633,7 @@
             <w:r>
               <w:rPr>
                 <w:rFonts w:ascii="Consolas" w:hAnsi="Consolas" w:eastAsia="Consolas"/>
-                <w:sz w:val="18"/>
+                <w:sz w:val="17"/>
               </w:rPr>
               <w:t>checkout()</w:t>
             </w:r>
@@ -1621,7 +1646,7 @@
             <w:r>
               <w:rPr>
                 <w:rFonts w:ascii="Consolas" w:hAnsi="Consolas" w:eastAsia="Consolas"/>
-                <w:sz w:val="18"/>
+                <w:sz w:val="17"/>
               </w:rPr>
               <w:t>checkout()</w:t>
             </w:r>
@@ -1634,7 +1659,7 @@
             <w:r>
               <w:rPr>
                 <w:rFonts w:ascii="Consolas" w:hAnsi="Consolas" w:eastAsia="Consolas"/>
-                <w:sz w:val="18"/>
+                <w:sz w:val="17"/>
               </w:rPr>
               <w:t>float</w:t>
             </w:r>
@@ -1647,7 +1672,7 @@
             <w:r>
               <w:rPr>
                 <w:rFonts w:ascii="Consolas" w:hAnsi="Consolas" w:eastAsia="Consolas"/>
-                <w:sz w:val="18"/>
+                <w:sz w:val="17"/>
               </w:rPr>
               <w:t>confirm()</w:t>
             </w:r>
@@ -4780,7 +4805,7 @@
         <w:t>tests</w:t>
       </w:r>
       <w:r>
-        <w:t xml:space="preserve">. La ejecución final con </w:t>
+        <w:t xml:space="preserve">. La ejecución final (28/10/2026) con </w:t>
       </w:r>
       <w:r>
         <w:rPr>
@@ -5452,6 +5477,55 @@
     </w:p>
     <w:p>
       <w:pPr>
+        <w:spacing w:before="0" w:after="120" w:line="276" w:lineRule="auto"/>
+        <w:jc w:val="both"/>
+      </w:pPr>
+      <w:r>
+        <w:t xml:space="preserve">También comprobamos dos cosas que la cobertura no muestra. Con </w:t>
+      </w:r>
+      <w:r>
+        <w:rPr>
+          <w:rFonts w:ascii="Consolas" w:hAnsi="Consolas" w:eastAsia="Consolas"/>
+          <w:sz w:val="18"/>
+        </w:rPr>
+        <w:t>--runxfail</w:t>
+      </w:r>
+      <w:r>
+        <w:t xml:space="preserve">, el único </w:t>
+      </w:r>
+      <w:r>
+        <w:rPr>
+          <w:rFonts w:ascii="Consolas" w:hAnsi="Consolas" w:eastAsia="Consolas"/>
+          <w:sz w:val="18"/>
+        </w:rPr>
+        <w:t>xfail</w:t>
+      </w:r>
+      <w:r>
+        <w:t xml:space="preserve"> falla exactamente en </w:t>
+      </w:r>
+      <w:r>
+        <w:rPr>
+          <w:rFonts w:ascii="Consolas" w:hAnsi="Consolas" w:eastAsia="Consolas"/>
+          <w:sz w:val="18"/>
+        </w:rPr>
+        <w:t>assert order.status != "CONFIRMED"</w:t>
+      </w:r>
+      <w:r>
+        <w:t xml:space="preserve">, es decir, por la causa documentada y no por otra (E5_02). Y una prueba temporal que deja un motor SQLite sin liberar hace fallar la suite por </w:t>
+      </w:r>
+      <w:r>
+        <w:rPr>
+          <w:rFonts w:ascii="Consolas" w:hAnsi="Consolas" w:eastAsia="Consolas"/>
+          <w:sz w:val="18"/>
+        </w:rPr>
+        <w:t>ResourceWarning</w:t>
+      </w:r>
+      <w:r>
+        <w:t>, lo que confirma que la limpieza de conexiones se vigila (E4_02; la prueba se ejecutó en un clon y no forma parte de la entrega).</w:t>
+      </w:r>
+    </w:p>
+    <w:p>
+      <w:pPr>
         <w:keepNext/>
         <w:spacing w:before="120"/>
         <w:jc w:val="center"/>
@@ -5459,7 +5533,7 @@
       <w:r>
         <w:drawing>
           <wp:inline xmlns:a="http://schemas.openxmlformats.org/drawingml/2006/main" xmlns:pic="http://schemas.openxmlformats.org/drawingml/2006/picture">
-            <wp:extent cx="5580000" cy="2039391"/>
+            <wp:extent cx="5580000" cy="2124365"/>
             <wp:docPr id="11" name="Picture 11"/>
             <wp:cNvGraphicFramePr>
               <a:graphicFrameLocks noChangeAspect="1"/>
@@ -5468,7 +5542,7 @@
               <a:graphicData uri="http://schemas.openxmlformats.org/drawingml/2006/picture">
                 <pic:pic>
                   <pic:nvPicPr>
-                    <pic:cNvPr id="0" name="E7_02_pytest_cobertura_html_l82-99.png"/>
+                    <pic:cNvPr id="0" name="E7_08_pytest_cobertura_html_revalidacion_20261028_l84-101.png"/>
                     <pic:cNvPicPr/>
                   </pic:nvPicPr>
                   <pic:blipFill>
@@ -5480,7 +5554,7 @@
                   <pic:spPr>
                     <a:xfrm>
                       <a:off x="0" y="0"/>
-                      <a:ext cx="5580000" cy="2039391"/>
+                      <a:ext cx="5580000" cy="2124365"/>
                     </a:xfrm>
                     <a:prstGeom prst="rect"/>
                   </pic:spPr>
@@ -5507,7 +5581,7 @@
         <w:rPr>
           <w:sz w:val="19"/>
         </w:rPr>
-        <w:t>Ruff y pytest con cobertura y reporte HTML (E7).</w:t>
+        <w:t>Pytest con cobertura y reporte HTML en la ejecución final del 28/10/2026 (E7).</w:t>
       </w:r>
     </w:p>
     <w:p>
@@ -5528,7 +5602,7 @@
               <a:graphicData uri="http://schemas.openxmlformats.org/drawingml/2006/picture">
                 <pic:pic>
                   <pic:nvPicPr>
-                    <pic:cNvPr id="0" name="E7_05_htmlcov_index.png"/>
+                    <pic:cNvPr id="0" name="E7_11_htmlcov_index_20261028.png"/>
                     <pic:cNvPicPr/>
                   </pic:nvPicPr>
                   <pic:blipFill>
@@ -5580,7 +5654,7 @@
         <w:rPr>
           <w:sz w:val="19"/>
         </w:rPr>
-        <w:t xml:space="preserve"> (captura del navegador).</w:t>
+        <w:t xml:space="preserve"> el 28/10/2026 (captura del navegador).</w:t>
       </w:r>
     </w:p>
     <w:p>
@@ -5922,47 +5996,142 @@
         <w:t>sobre ese código</w:t>
       </w:r>
       <w:r>
-        <w:t xml:space="preserve">, sin crear un módulo de referencia ni cambiar </w:t>
+        <w:t xml:space="preserve">, sin crear un módulo de referencia ni cambiar reglas. Viven en </w:t>
       </w:r>
       <w:r>
         <w:rPr>
           <w:rFonts w:ascii="Consolas" w:hAnsi="Consolas" w:eastAsia="Consolas"/>
           <w:sz w:val="18"/>
         </w:rPr>
-        <w:t>src/</w:t>
-      </w:r>
-      <w:r>
-        <w:t xml:space="preserve">. Viven en </w:t>
+        <w:t>tests_u5/</w:t>
+      </w:r>
+      <w:r>
+        <w:t xml:space="preserve"> y usan el mismo ayudante de flujo que la suite del equipo (</w:t>
       </w:r>
       <w:r>
         <w:rPr>
           <w:rFonts w:ascii="Consolas" w:hAnsi="Consolas" w:eastAsia="Consolas"/>
           <w:sz w:val="18"/>
         </w:rPr>
-        <w:t>tests_u5/</w:t>
-      </w:r>
-      <w:r>
-        <w:t xml:space="preserve"> y usan el mismo ayudante de flujo que la suite del equipo (</w:t>
+        <w:t>tests/apoyo_flujo.py</w:t>
+      </w:r>
+      <w:r>
+        <w:t xml:space="preserve">). Probamos la copia tal como se entregó: commit </w:t>
       </w:r>
       <w:r>
         <w:rPr>
           <w:rFonts w:ascii="Consolas" w:hAnsi="Consolas" w:eastAsia="Consolas"/>
           <w:sz w:val="18"/>
         </w:rPr>
-        <w:t>tests/apoyo_flujo.py</w:t>
-      </w:r>
-      <w:r>
-        <w:t xml:space="preserve">). Probamos la copia tal como se entregó: commit </w:t>
+        <w:t>6b501af</w:t>
+      </w:r>
+      <w:r>
+        <w:t xml:space="preserve"> más los cambios locales sin confirmar que contenía.</w:t>
+      </w:r>
+    </w:p>
+    <w:p>
+      <w:pPr>
+        <w:spacing w:before="0" w:after="120" w:line="276" w:lineRule="auto"/>
+        <w:jc w:val="both"/>
+      </w:pPr>
+      <w:r>
+        <w:rPr>
+          <w:b/>
+        </w:rPr>
+        <w:t>Corrección del empaquetado (28/10/2026).</w:t>
+      </w:r>
+      <w:r>
+        <w:t xml:space="preserve"> En el ZIP v1 solo iba la carpeta </w:t>
       </w:r>
       <w:r>
         <w:rPr>
           <w:rFonts w:ascii="Consolas" w:hAnsi="Consolas" w:eastAsia="Consolas"/>
           <w:sz w:val="18"/>
         </w:rPr>
-        <w:t>6b501af</w:t>
-      </w:r>
-      <w:r>
-        <w:t xml:space="preserve"> más los cambios locales sin confirmar que contenía.</w:t>
+        <w:t>tests_u5/</w:t>
+      </w:r>
+      <w:r>
+        <w:t xml:space="preserve">; su </w:t>
+      </w:r>
+      <w:r>
+        <w:rPr>
+          <w:rFonts w:ascii="Consolas" w:hAnsi="Consolas" w:eastAsia="Consolas"/>
+          <w:sz w:val="18"/>
+        </w:rPr>
+        <w:t>conftest.py</w:t>
+      </w:r>
+      <w:r>
+        <w:t xml:space="preserve"> agregaba a </w:t>
+      </w:r>
+      <w:r>
+        <w:rPr>
+          <w:rFonts w:ascii="Consolas" w:hAnsi="Consolas" w:eastAsia="Consolas"/>
+          <w:sz w:val="18"/>
+        </w:rPr>
+        <w:t>sys.path</w:t>
+      </w:r>
+      <w:r>
+        <w:t xml:space="preserve"> las carpetas </w:t>
+      </w:r>
+      <w:r>
+        <w:rPr>
+          <w:rFonts w:ascii="Consolas" w:hAnsi="Consolas" w:eastAsia="Consolas"/>
+          <w:sz w:val="18"/>
+        </w:rPr>
+        <w:t>../src</w:t>
+      </w:r>
+      <w:r>
+        <w:t xml:space="preserve"> y </w:t>
+      </w:r>
+      <w:r>
+        <w:rPr>
+          <w:rFonts w:ascii="Consolas" w:hAnsi="Consolas" w:eastAsia="Consolas"/>
+          <w:sz w:val="18"/>
+        </w:rPr>
+        <w:t>../tests</w:t>
+      </w:r>
+      <w:r>
+        <w:t xml:space="preserve">, que en el ZIP no existían, y los cinco archivos de prueba fallaban al recopilarse (E9_09, E9_10). Agregar rutas no lo habría resuelto, porque el código no estaba. Ahora el ZIP incluye una copia del repositorio del equipo en </w:t>
+      </w:r>
+      <w:r>
+        <w:rPr>
+          <w:rFonts w:ascii="Consolas" w:hAnsi="Consolas" w:eastAsia="Consolas"/>
+          <w:sz w:val="18"/>
+        </w:rPr>
+        <w:t>pia_eventos_nova/Eventosnova/</w:t>
+      </w:r>
+      <w:r>
+        <w:t xml:space="preserve"> con </w:t>
+      </w:r>
+      <w:r>
+        <w:rPr>
+          <w:rFonts w:ascii="Consolas" w:hAnsi="Consolas" w:eastAsia="Consolas"/>
+          <w:sz w:val="18"/>
+        </w:rPr>
+        <w:t>tests_u5/</w:t>
+      </w:r>
+      <w:r>
+        <w:t xml:space="preserve"> en su raíz y un </w:t>
+      </w:r>
+      <w:r>
+        <w:rPr>
+          <w:rFonts w:ascii="Consolas" w:hAnsi="Consolas" w:eastAsia="Consolas"/>
+          <w:sz w:val="18"/>
+        </w:rPr>
+        <w:t>pytest.ini</w:t>
+      </w:r>
+      <w:r>
+        <w:t xml:space="preserve">, y </w:t>
+      </w:r>
+      <w:r>
+        <w:rPr>
+          <w:rFonts w:ascii="Consolas" w:hAnsi="Consolas" w:eastAsia="Consolas"/>
+          <w:sz w:val="18"/>
+        </w:rPr>
+        <w:t>conftest.py</w:t>
+      </w:r>
+      <w:r>
+        <w:t xml:space="preserve"> detiene la ejecución con un mensaje claro si falta el código (E9_18).</w:t>
       </w:r>
     </w:p>
     <w:p>
@@ -6493,46 +6662,119 @@
     <w:p>
       <w:pPr>
         <w:spacing w:before="0" w:after="120" w:line="276" w:lineRule="auto"/>
+      </w:pPr>
+      <w:r>
+        <w:rPr>
+          <w:b/>
+        </w:rPr>
+        <w:t>Hallazgo U5-H1 y su corrección.</w:t>
+      </w:r>
+      <w:r>
+        <w:t xml:space="preserve"> En la primera sesión PIA-03b quedó como </w:t>
+      </w:r>
+      <w:r>
+        <w:rPr>
+          <w:rFonts w:ascii="Consolas" w:hAnsi="Consolas" w:eastAsia="Consolas"/>
+          <w:sz w:val="18"/>
+        </w:rPr>
+        <w:t>xfail</w:t>
+      </w:r>
+      <w:r>
+        <w:t xml:space="preserve">: al reintentar la evaluación de una solicitud que ya era No procedente, el servicio consultaba al proveedor externo antes de que el dominio la rechazara, aunque CA-083 indica no continuar con la búsqueda. En la segunda sesión quitamos el </w:t>
+      </w:r>
+      <w:r>
+        <w:rPr>
+          <w:rFonts w:ascii="Consolas" w:hAnsi="Consolas" w:eastAsia="Consolas"/>
+          <w:sz w:val="18"/>
+        </w:rPr>
+        <w:t>xfail</w:t>
+      </w:r>
+      <w:r>
+        <w:t xml:space="preserve"> y la prueba falló por esa causa (RED, E9_11). Agregamos </w:t>
+      </w:r>
+      <w:r>
+        <w:rPr>
+          <w:rFonts w:ascii="Consolas" w:hAnsi="Consolas" w:eastAsia="Consolas"/>
+          <w:sz w:val="18"/>
+        </w:rPr>
+        <w:t>motivo_rechazo_registro_disponibilidad()</w:t>
+      </w:r>
+      <w:r>
+        <w:t xml:space="preserve"> en </w:t>
+      </w:r>
+      <w:r>
+        <w:rPr>
+          <w:rFonts w:ascii="Consolas" w:hAnsi="Consolas" w:eastAsia="Consolas"/>
+          <w:sz w:val="18"/>
+        </w:rPr>
+        <w:t>SolicitudServicioAdicional</w:t>
+      </w:r>
+      <w:r>
+        <w:t xml:space="preserve">, que usa la misma máquina de estados y el mismo mensaje, y el servicio rechaza antes de la consulta: la prueba pasó (GREEN, E9_12). La corrección está aplicada </w:t>
+      </w:r>
+      <w:r>
+        <w:rPr>
+          <w:b/>
+        </w:rPr>
+        <w:t>solo en la copia</w:t>
+      </w:r>
+      <w:r>
+        <w:t xml:space="preserve"> incluida en el ZIP; el parche </w:t>
+      </w:r>
+      <w:r>
+        <w:rPr>
+          <w:rFonts w:ascii="Consolas" w:hAnsi="Consolas" w:eastAsia="Consolas"/>
+          <w:sz w:val="18"/>
+        </w:rPr>
+        <w:t>PARCHE_U5H1_consulta_proveedores.patch</w:t>
+      </w:r>
+      <w:r>
+        <w:t xml:space="preserve"> queda para que el equipo decida si lo lleva a su repositorio.</w:t>
+      </w:r>
+    </w:p>
+    <w:p>
+      <w:pPr>
+        <w:spacing w:before="0" w:after="120" w:line="276" w:lineRule="auto"/>
         <w:jc w:val="both"/>
       </w:pPr>
       <w:r>
         <w:rPr>
           <w:b/>
         </w:rPr>
-        <w:t>Resultado.</w:t>
-      </w:r>
-      <w:r>
-        <w:t xml:space="preserve"> 21 pruebas aprobadas y 1 </w:t>
+        <w:t>Resultado (28/10/2026).</w:t>
+      </w:r>
+      <w:r>
+        <w:t xml:space="preserve"> 22 pruebas aprobadas, Ruff sin errores. Las pruebas de PostgreSQL corrieron con </w:t>
       </w:r>
       <w:r>
         <w:rPr>
           <w:rFonts w:ascii="Consolas" w:hAnsi="Consolas" w:eastAsia="Consolas"/>
           <w:sz w:val="18"/>
         </w:rPr>
-        <w:t>xfail</w:t>
-      </w:r>
-      <w:r>
-        <w:t xml:space="preserve">, Ruff sin errores. Las pruebas de PostgreSQL corrieron con </w:t>
+        <w:t>EVENTOSNOVA_REQUIERE_BD=1</w:t>
+      </w:r>
+      <w:r>
+        <w:t xml:space="preserve">, que convierte la falta de base en fallo, así que no se omitieron; sin PostgreSQL, 19 se ejecutan y 3 se omiten. La cobertura de </w:t>
       </w:r>
       <w:r>
         <w:rPr>
           <w:rFonts w:ascii="Consolas" w:hAnsi="Consolas" w:eastAsia="Consolas"/>
           <w:sz w:val="18"/>
         </w:rPr>
-        <w:t>EVENTOSNOVA_REQUIERE_BD=1</w:t>
-      </w:r>
-      <w:r>
-        <w:t xml:space="preserve">, que convierte la falta de base en fallo, así que no se omitieron. La cobertura de </w:t>
+        <w:t>src/</w:t>
+      </w:r>
+      <w:r>
+        <w:t xml:space="preserve"> con solo </w:t>
       </w:r>
       <w:r>
         <w:rPr>
           <w:rFonts w:ascii="Consolas" w:hAnsi="Consolas" w:eastAsia="Consolas"/>
           <w:sz w:val="18"/>
         </w:rPr>
-        <w:t>src/</w:t>
-      </w:r>
-      <w:r>
-        <w:t xml:space="preserve"> con solo </w:t>
+        <w:t>tests_u5</w:t>
+      </w:r>
+      <w:r>
+        <w:t xml:space="preserve"> es 50.4 %, lo esperable para 22 pruebas enfocadas en cuatro reglas. Con la suite del equipo más </w:t>
       </w:r>
       <w:r>
         <w:rPr>
@@ -6542,17 +6784,7 @@
         <w:t>tests_u5</w:t>
       </w:r>
       <w:r>
-        <w:t xml:space="preserve"> es 50.4 %, lo esperable para 22 pruebas enfocadas en cuatro reglas. Con la suite del equipo más </w:t>
-      </w:r>
-      <w:r>
-        <w:rPr>
-          <w:rFonts w:ascii="Consolas" w:hAnsi="Consolas" w:eastAsia="Consolas"/>
-          <w:sz w:val="18"/>
-        </w:rPr>
-        <w:t>tests_u5</w:t>
-      </w:r>
-      <w:r>
-        <w:t xml:space="preserve"> la cobertura de sentencias es 98.82 % y la de ramas 95.85 %.</w:t>
+        <w:t xml:space="preserve"> la cobertura de sentencias es 98.83 % y la de ramas 95.86 %. La suite del equipo conserva sus 1 306 pruebas con el mismo único fallo de entorno que antes de la corrección (E9_13).</w:t>
       </w:r>
     </w:p>
     <w:p>
@@ -7019,7 +7251,7 @@
       <w:r>
         <w:drawing>
           <wp:inline xmlns:a="http://schemas.openxmlformats.org/drawingml/2006/main" xmlns:pic="http://schemas.openxmlformats.org/drawingml/2006/picture">
-            <wp:extent cx="5940000" cy="3614924"/>
+            <wp:extent cx="5940000" cy="2713706"/>
             <wp:docPr id="15" name="Picture 15"/>
             <wp:cNvGraphicFramePr>
               <a:graphicFrameLocks noChangeAspect="1"/>
@@ -7028,11 +7260,84 @@
               <a:graphicData uri="http://schemas.openxmlformats.org/drawingml/2006/picture">
                 <pic:pic>
                   <pic:nvPicPr>
-                    <pic:cNvPr id="0" name="E9_03_pytest_tests_u5.png"/>
+                    <pic:cNvPr id="0" name="E9_09_diagnostico_v1_ModuleNotFoundError_20261028_l1-24.png"/>
                     <pic:cNvPicPr/>
                   </pic:nvPicPr>
                   <pic:blipFill>
                     <a:blip r:embed="rId32"/>
+                    <a:stretch>
+                      <a:fillRect/>
+                    </a:stretch>
+                  </pic:blipFill>
+                  <pic:spPr>
+                    <a:xfrm>
+                      <a:off x="0" y="0"/>
+                      <a:ext cx="5940000" cy="2713706"/>
+                    </a:xfrm>
+                    <a:prstGeom prst="rect"/>
+                  </pic:spPr>
+                </pic:pic>
+              </a:graphicData>
+            </a:graphic>
+          </wp:inline>
+        </w:drawing>
+      </w:r>
+    </w:p>
+    <w:p>
+      <w:pPr>
+        <w:spacing w:before="80" w:after="120" w:line="276" w:lineRule="auto"/>
+        <w:jc w:val="center"/>
+      </w:pPr>
+      <w:r>
+        <w:rPr>
+          <w:b/>
+          <w:sz w:val="19"/>
+        </w:rPr>
+        <w:t xml:space="preserve">Figura 15. </w:t>
+      </w:r>
+      <w:r>
+        <w:rPr>
+          <w:sz w:val="19"/>
+        </w:rPr>
+        <w:t xml:space="preserve">Diagnóstico del ZIP v1: los cinco archivos de </w:t>
+      </w:r>
+      <w:r>
+        <w:rPr>
+          <w:rFonts w:ascii="Consolas" w:hAnsi="Consolas" w:eastAsia="Consolas"/>
+          <w:sz w:val="18"/>
+        </w:rPr>
+        <w:t>tests_u5</w:t>
+      </w:r>
+      <w:r>
+        <w:rPr>
+          <w:sz w:val="19"/>
+        </w:rPr>
+        <w:t xml:space="preserve"> fallan al recopilarse porque el paquete no incluía el código del PIA (E9, 28/10/2026).</w:t>
+      </w:r>
+    </w:p>
+    <w:p>
+      <w:pPr>
+        <w:keepNext/>
+        <w:spacing w:before="120"/>
+        <w:jc w:val="center"/>
+      </w:pPr>
+      <w:r>
+        <w:drawing>
+          <wp:inline xmlns:a="http://schemas.openxmlformats.org/drawingml/2006/main" xmlns:pic="http://schemas.openxmlformats.org/drawingml/2006/picture">
+            <wp:extent cx="5940000" cy="3614924"/>
+            <wp:docPr id="16" name="Picture 16"/>
+            <wp:cNvGraphicFramePr>
+              <a:graphicFrameLocks noChangeAspect="1"/>
+            </wp:cNvGraphicFramePr>
+            <a:graphic>
+              <a:graphicData uri="http://schemas.openxmlformats.org/drawingml/2006/picture">
+                <pic:pic>
+                  <pic:nvPicPr>
+                    <pic:cNvPr id="0" name="E9_11_U5H1_RED_sin_xfail_20261028_l16-48.png"/>
+                    <pic:cNvPicPr/>
+                  </pic:nvPicPr>
+                  <pic:blipFill>
+                    <a:blip r:embed="rId33"/>
                     <a:stretch>
                       <a:fillRect/>
                     </a:stretch>
@@ -7061,13 +7366,86 @@
           <w:b/>
           <w:sz w:val="19"/>
         </w:rPr>
-        <w:t xml:space="preserve">Figura 15. </w:t>
+        <w:t xml:space="preserve">Figura 16. </w:t>
       </w:r>
       <w:r>
         <w:rPr>
           <w:sz w:val="19"/>
         </w:rPr>
-        <w:t>Pruebas U5 sobre el código real de Eventos Nova (E9): 21 aprobadas y 1 XFAIL.</w:t>
+        <w:t xml:space="preserve">RED de U5-H1: sin </w:t>
+      </w:r>
+      <w:r>
+        <w:rPr>
+          <w:rFonts w:ascii="Consolas" w:hAnsi="Consolas" w:eastAsia="Consolas"/>
+          <w:sz w:val="18"/>
+        </w:rPr>
+        <w:t>xfail</w:t>
+      </w:r>
+      <w:r>
+        <w:rPr>
+          <w:sz w:val="19"/>
+        </w:rPr>
+        <w:t>, PIA-03b falla porque el mock del proveedor se llamó una vez (E9, 28/10/2026).</w:t>
+      </w:r>
+    </w:p>
+    <w:p>
+      <w:pPr>
+        <w:keepNext/>
+        <w:spacing w:before="120"/>
+        <w:jc w:val="center"/>
+      </w:pPr>
+      <w:r>
+        <w:drawing>
+          <wp:inline xmlns:a="http://schemas.openxmlformats.org/drawingml/2006/main" xmlns:pic="http://schemas.openxmlformats.org/drawingml/2006/picture">
+            <wp:extent cx="5940000" cy="3343553"/>
+            <wp:docPr id="17" name="Picture 17"/>
+            <wp:cNvGraphicFramePr>
+              <a:graphicFrameLocks noChangeAspect="1"/>
+            </wp:cNvGraphicFramePr>
+            <a:graphic>
+              <a:graphicData uri="http://schemas.openxmlformats.org/drawingml/2006/picture">
+                <pic:pic>
+                  <pic:nvPicPr>
+                    <pic:cNvPr id="0" name="E9_15_pytest_tests_u5_20261028.png"/>
+                    <pic:cNvPicPr/>
+                  </pic:nvPicPr>
+                  <pic:blipFill>
+                    <a:blip r:embed="rId34"/>
+                    <a:stretch>
+                      <a:fillRect/>
+                    </a:stretch>
+                  </pic:blipFill>
+                  <pic:spPr>
+                    <a:xfrm>
+                      <a:off x="0" y="0"/>
+                      <a:ext cx="5940000" cy="3343553"/>
+                    </a:xfrm>
+                    <a:prstGeom prst="rect"/>
+                  </pic:spPr>
+                </pic:pic>
+              </a:graphicData>
+            </a:graphic>
+          </wp:inline>
+        </w:drawing>
+      </w:r>
+    </w:p>
+    <w:p>
+      <w:pPr>
+        <w:spacing w:before="80" w:after="120" w:line="276" w:lineRule="auto"/>
+        <w:jc w:val="center"/>
+      </w:pPr>
+      <w:r>
+        <w:rPr>
+          <w:b/>
+          <w:sz w:val="19"/>
+        </w:rPr>
+        <w:t xml:space="preserve">Figura 17. </w:t>
+      </w:r>
+      <w:r>
+        <w:rPr>
+          <w:sz w:val="19"/>
+        </w:rPr>
+        <w:t>Pruebas U5 sobre el código real de Eventos Nova después de la corrección: 22 aprobadas (E9, 28/10/2026).</w:t>
       </w:r>
     </w:p>
     <w:p>
@@ -7085,17 +7463,27 @@
         <w:jc w:val="both"/>
       </w:pPr>
       <w:r>
-        <w:t>Usamos Claude (Anthropic) en una sesión de trabajo con acceso a archivos y terminal. El equipo le dio un solo prompt: las instrucciones de esta actividad, con el material de la unidad y el ZIP de Eventos Nova. La bitácora (</w:t>
+        <w:t>Usamos Claude (Anthropic) con acceso a archivos y terminal en dos sesiones: el 27/10 con las instrucciones de la actividad y el 28/10 con el documento de revisión correctiva. La bitácora formal (</w:t>
       </w:r>
       <w:r>
         <w:rPr>
           <w:rFonts w:ascii="Consolas" w:hAnsi="Consolas" w:eastAsia="Consolas"/>
           <w:sz w:val="18"/>
         </w:rPr>
+        <w:t>docs/BITACORA_IA_ACTIVIDAD5.docx</w:t>
+      </w:r>
+      <w:r>
+        <w:t xml:space="preserve">, con su versión en </w:t>
+      </w:r>
+      <w:r>
+        <w:rPr>
+          <w:rFonts w:ascii="Consolas" w:hAnsi="Consolas" w:eastAsia="Consolas"/>
+          <w:sz w:val="18"/>
+        </w:rPr>
         <w:t>bitacora_uso_IA.md</w:t>
       </w:r>
       <w:r>
-        <w:t>) registra 11 propuestas de la IA: qué se propuso, cómo se revisó contra los documentos y la ejecución, y qué se decidió. No usamos el prompt sugerido de la guía y no hubo otras consultas.</w:t>
+        <w:t>) registra las iteraciones, las propuestas aceptadas, corregidas y rechazadas, sus pruebas y las decisiones que el equipo debe aprobar. La primera sesión se reconstruye a partir de los registros; no se presenta como una transcripción literal. No usamos el prompt sugerido de la guía y no hubo otras consultas.</w:t>
       </w:r>
     </w:p>
     <w:p>
@@ -7133,7 +7521,17 @@
         <w:t>assert … == []</w:t>
       </w:r>
       <w:r>
-        <w:t>. También rechazamos la lista inicial de reglas de la guía cuando no coincidía con el BRD (Tabla 5). La revisión del equipo sobre cada entrada de la bitácora debe registrarse antes de entregar.</w:t>
+        <w:t xml:space="preserve">. También rechazamos la lista inicial de reglas de la guía cuando no coincidía con el BRD (Tabla 5). En la segunda sesión, el primer comentario de la corrección U5-H1 citaba «CA-083» y el generador de trazabilidad del equipo lo incorporó a su documento, por lo que </w:t>
+      </w:r>
+      <w:r>
+        <w:rPr>
+          <w:rFonts w:ascii="Consolas" w:hAnsi="Consolas" w:eastAsia="Consolas"/>
+          <w:sz w:val="18"/>
+        </w:rPr>
+        <w:t>test_trazabilidad_api</w:t>
+      </w:r>
+      <w:r>
+        <w:t xml:space="preserve"> falló; se retiró la cita. La columna de revisión de cada integrante en la bitácora está pendiente y debe completarse antes de entregar.</w:t>
       </w:r>
     </w:p>
     <w:p>
@@ -7301,7 +7699,7 @@
         <w:rPr>
           <w:sz w:val="19"/>
         </w:rPr>
-        <w:t>Comandos ejecutados y resultados verificables</w:t>
+        <w:t>Comandos ejecutados y resultados verificables (ejecución final del 28/10/2026, salvo actionlint)</w:t>
       </w:r>
     </w:p>
     <w:tbl>
@@ -7416,9 +7814,9 @@
             <w:r>
               <w:rPr>
                 <w:rFonts w:ascii="Consolas" w:hAnsi="Consolas" w:eastAsia="Consolas"/>
-                <w:sz w:val="18"/>
-              </w:rPr>
-              <w:t>python -m ruff check src tests</w:t>
+                <w:sz w:val="17"/>
+              </w:rPr>
+              <w:t>python -m pytest -v</w:t>
             </w:r>
           </w:p>
         </w:tc>
@@ -7436,7 +7834,7 @@
               <w:rPr>
                 <w:sz w:val="17"/>
               </w:rPr>
-              <w:t>All checks passed</w:t>
+              <w:t>69 aprobadas, 1 xfail</w:t>
             </w:r>
           </w:p>
         </w:tc>
@@ -7476,9 +7874,9 @@
             <w:r>
               <w:rPr>
                 <w:rFonts w:ascii="Consolas" w:hAnsi="Consolas" w:eastAsia="Consolas"/>
-                <w:sz w:val="18"/>
-              </w:rPr>
-              <w:t>python -m pytest -v --cov=src --cov-report=term-missing --cov-report=html --cov-fail-under=80</w:t>
+                <w:sz w:val="17"/>
+              </w:rPr>
+              <w:t>python -m ruff check src tests</w:t>
             </w:r>
           </w:p>
         </w:tc>
@@ -7496,20 +7894,7 @@
               <w:rPr>
                 <w:sz w:val="17"/>
               </w:rPr>
-              <w:t xml:space="preserve">69 aprobadas, 1 xfail; cobertura 100 %; </w:t>
-            </w:r>
-            <w:r>
-              <w:rPr>
-                <w:rFonts w:ascii="Consolas" w:hAnsi="Consolas" w:eastAsia="Consolas"/>
-                <w:sz w:val="18"/>
-              </w:rPr>
-              <w:t>htmlcov/index.html</w:t>
-            </w:r>
-            <w:r>
-              <w:rPr>
-                <w:sz w:val="17"/>
-              </w:rPr>
-              <w:t xml:space="preserve"> generado</w:t>
+              <w:t>All checks passed</w:t>
             </w:r>
           </w:p>
         </w:tc>
@@ -7549,9 +7934,9 @@
             <w:r>
               <w:rPr>
                 <w:rFonts w:ascii="Consolas" w:hAnsi="Consolas" w:eastAsia="Consolas"/>
-                <w:sz w:val="18"/>
-              </w:rPr>
-              <w:t>python -m pytest -q --cov=src --cov-branch</w:t>
+                <w:sz w:val="17"/>
+              </w:rPr>
+              <w:t>python -m pytest -v --cov=src --cov-report=term-missing --cov-report=html --cov-fail-under=80</w:t>
             </w:r>
           </w:p>
         </w:tc>
@@ -7569,7 +7954,20 @@
               <w:rPr>
                 <w:sz w:val="17"/>
               </w:rPr>
-              <w:t>Líneas y ramas: 100 %</w:t>
+              <w:t xml:space="preserve">69 aprobadas, 1 xfail; cobertura 100 %; </w:t>
+            </w:r>
+            <w:r>
+              <w:rPr>
+                <w:rFonts w:ascii="Consolas" w:hAnsi="Consolas" w:eastAsia="Consolas"/>
+                <w:sz w:val="17"/>
+              </w:rPr>
+              <w:t>htmlcov/index.html</w:t>
+            </w:r>
+            <w:r>
+              <w:rPr>
+                <w:sz w:val="17"/>
+              </w:rPr>
+              <w:t xml:space="preserve"> generado</w:t>
             </w:r>
           </w:p>
         </w:tc>
@@ -7609,9 +8007,9 @@
             <w:r>
               <w:rPr>
                 <w:rFonts w:ascii="Consolas" w:hAnsi="Consolas" w:eastAsia="Consolas"/>
-                <w:sz w:val="18"/>
-              </w:rPr>
-              <w:t>python -m compileall -q src</w:t>
+                <w:sz w:val="17"/>
+              </w:rPr>
+              <w:t>python -m pytest -q --cov=src --cov-branch</w:t>
             </w:r>
           </w:p>
         </w:tc>
@@ -7629,7 +8027,7 @@
               <w:rPr>
                 <w:sz w:val="17"/>
               </w:rPr>
-              <w:t>Código de salida 0</w:t>
+              <w:t>Líneas y ramas: 100 %</w:t>
             </w:r>
           </w:p>
         </w:tc>
@@ -7669,9 +8067,9 @@
             <w:r>
               <w:rPr>
                 <w:rFonts w:ascii="Consolas" w:hAnsi="Consolas" w:eastAsia="Consolas"/>
-                <w:sz w:val="18"/>
-              </w:rPr>
-              <w:t>actionlint .github/workflows/ci.yml</w:t>
+                <w:sz w:val="17"/>
+              </w:rPr>
+              <w:t>python -m compileall -q src</w:t>
             </w:r>
           </w:p>
         </w:tc>
@@ -7689,7 +8087,7 @@
               <w:rPr>
                 <w:sz w:val="17"/>
               </w:rPr>
-              <w:t>0 errores</w:t>
+              <w:t>Código de salida 0</w:t>
             </w:r>
           </w:p>
         </w:tc>
@@ -7712,7 +8110,7 @@
               <w:rPr>
                 <w:sz w:val="17"/>
               </w:rPr>
-              <w:t>Eventos Nova</w:t>
+              <w:t>Laboratorio</w:t>
             </w:r>
           </w:p>
         </w:tc>
@@ -7729,9 +8127,15 @@
             <w:r>
               <w:rPr>
                 <w:rFonts w:ascii="Consolas" w:hAnsi="Consolas" w:eastAsia="Consolas"/>
-                <w:sz w:val="18"/>
-              </w:rPr>
-              <w:t>python -m pytest tests_u5 -v -rxX</w:t>
+                <w:sz w:val="17"/>
+              </w:rPr>
+              <w:t>actionlint .github/workflows/ci.yml</w:t>
+            </w:r>
+            <w:r>
+              <w:rPr>
+                <w:sz w:val="17"/>
+              </w:rPr>
+              <w:t xml:space="preserve"> (27/10/2026)</w:t>
             </w:r>
           </w:p>
         </w:tc>
@@ -7749,7 +8153,7 @@
               <w:rPr>
                 <w:sz w:val="17"/>
               </w:rPr>
-              <w:t>21 aprobadas, 1 xfail (PostgreSQL 16 local)</w:t>
+              <w:t>0 errores</w:t>
             </w:r>
           </w:p>
         </w:tc>
@@ -7789,9 +8193,28 @@
             <w:r>
               <w:rPr>
                 <w:rFonts w:ascii="Consolas" w:hAnsi="Consolas" w:eastAsia="Consolas"/>
-                <w:sz w:val="18"/>
-              </w:rPr>
-              <w:t>python -m ruff check tests_u5</w:t>
+                <w:sz w:val="17"/>
+              </w:rPr>
+              <w:t>python -m pytest tests_u5 -v -rxX</w:t>
+            </w:r>
+            <w:r>
+              <w:rPr>
+                <w:sz w:val="17"/>
+              </w:rPr>
+              <w:t xml:space="preserve"> (en </w:t>
+            </w:r>
+            <w:r>
+              <w:rPr>
+                <w:rFonts w:ascii="Consolas" w:hAnsi="Consolas" w:eastAsia="Consolas"/>
+                <w:sz w:val="17"/>
+              </w:rPr>
+              <w:t>pia_eventos_nova/Eventosnova</w:t>
+            </w:r>
+            <w:r>
+              <w:rPr>
+                <w:sz w:val="17"/>
+              </w:rPr>
+              <w:t>)</w:t>
             </w:r>
           </w:p>
         </w:tc>
@@ -7809,7 +8232,7 @@
               <w:rPr>
                 <w:sz w:val="17"/>
               </w:rPr>
-              <w:t>All checks passed</w:t>
+              <w:t>22 aprobadas (PostgreSQL 16 local)</w:t>
             </w:r>
           </w:p>
         </w:tc>
@@ -7849,22 +8272,9 @@
             <w:r>
               <w:rPr>
                 <w:rFonts w:ascii="Consolas" w:hAnsi="Consolas" w:eastAsia="Consolas"/>
-                <w:sz w:val="18"/>
-              </w:rPr>
-              <w:t>coverage run -m unittest discover -s tests</w:t>
-            </w:r>
-            <w:r>
-              <w:rPr>
-                <w:sz w:val="17"/>
-              </w:rPr>
-              <w:t xml:space="preserve"> + </w:t>
-            </w:r>
-            <w:r>
-              <w:rPr>
-                <w:rFonts w:ascii="Consolas" w:hAnsi="Consolas" w:eastAsia="Consolas"/>
-                <w:sz w:val="18"/>
-              </w:rPr>
-              <w:t>coverage run -a -m pytest tests_u5</w:t>
+                <w:sz w:val="17"/>
+              </w:rPr>
+              <w:t>python -m ruff check tests_u5</w:t>
             </w:r>
           </w:p>
         </w:tc>
@@ -7882,7 +8292,7 @@
               <w:rPr>
                 <w:sz w:val="17"/>
               </w:rPr>
-              <w:t>Sentencias 98.82 %, ramas 95.85 % (mínimo 80 %: cumple)</w:t>
+              <w:t>All checks passed</w:t>
             </w:r>
           </w:p>
         </w:tc>
@@ -7897,6 +8307,7 @@
           </w:tcPr>
           <w:p>
             <w:pPr>
+              <w:keepNext/>
               <w:spacing w:after="20"/>
             </w:pPr>
             <w:r/>
@@ -7914,13 +8325,85 @@
           </w:tcPr>
           <w:p>
             <w:pPr>
+              <w:keepNext/>
               <w:spacing w:after="20"/>
             </w:pPr>
             <w:r/>
             <w:r>
               <w:rPr>
                 <w:rFonts w:ascii="Consolas" w:hAnsi="Consolas" w:eastAsia="Consolas"/>
-                <w:sz w:val="18"/>
+                <w:sz w:val="17"/>
+              </w:rPr>
+              <w:t>coverage run -m unittest discover -s tests</w:t>
+            </w:r>
+            <w:r>
+              <w:rPr>
+                <w:sz w:val="17"/>
+              </w:rPr>
+              <w:t xml:space="preserve"> + </w:t>
+            </w:r>
+            <w:r>
+              <w:rPr>
+                <w:rFonts w:ascii="Consolas" w:hAnsi="Consolas" w:eastAsia="Consolas"/>
+                <w:sz w:val="17"/>
+              </w:rPr>
+              <w:t>coverage run -a -m pytest tests_u5</w:t>
+            </w:r>
+          </w:p>
+        </w:tc>
+        <w:tc>
+          <w:tcPr>
+            <w:tcW w:type="dxa" w:w="3175"/>
+          </w:tcPr>
+          <w:p>
+            <w:pPr>
+              <w:keepNext/>
+              <w:spacing w:after="20"/>
+            </w:pPr>
+            <w:r/>
+            <w:r>
+              <w:rPr>
+                <w:sz w:val="17"/>
+              </w:rPr>
+              <w:t>Sentencias 98.83 %, ramas 95.86 % (mínimo 80 %: cumple)</w:t>
+            </w:r>
+          </w:p>
+        </w:tc>
+      </w:tr>
+      <w:tr>
+        <w:trPr>
+          <w:cantSplit w:val="true"/>
+        </w:trPr>
+        <w:tc>
+          <w:tcPr>
+            <w:tcW w:type="dxa" w:w="1474"/>
+          </w:tcPr>
+          <w:p>
+            <w:pPr>
+              <w:spacing w:after="20"/>
+            </w:pPr>
+            <w:r/>
+            <w:r>
+              <w:rPr>
+                <w:sz w:val="17"/>
+              </w:rPr>
+              <w:t>Eventos Nova</w:t>
+            </w:r>
+          </w:p>
+        </w:tc>
+        <w:tc>
+          <w:tcPr>
+            <w:tcW w:type="dxa" w:w="5216"/>
+          </w:tcPr>
+          <w:p>
+            <w:pPr>
+              <w:spacing w:after="20"/>
+            </w:pPr>
+            <w:r/>
+            <w:r>
+              <w:rPr>
+                <w:rFonts w:ascii="Consolas" w:hAnsi="Consolas" w:eastAsia="Consolas"/>
+                <w:sz w:val="17"/>
               </w:rPr>
               <w:t>coverage run -m unittest discover -s tests</w:t>
             </w:r>
@@ -7966,8 +8449,8 @@
       <w:r>
         <w:drawing>
           <wp:inline xmlns:a="http://schemas.openxmlformats.org/drawingml/2006/main" xmlns:pic="http://schemas.openxmlformats.org/drawingml/2006/picture">
-            <wp:extent cx="5940000" cy="3162640"/>
-            <wp:docPr id="16" name="Picture 16"/>
+            <wp:extent cx="5940000" cy="2894619"/>
+            <wp:docPr id="18" name="Picture 18"/>
             <wp:cNvGraphicFramePr>
               <a:graphicFrameLocks noChangeAspect="1"/>
             </wp:cNvGraphicFramePr>
@@ -7975,11 +8458,11 @@
               <a:graphicData uri="http://schemas.openxmlformats.org/drawingml/2006/picture">
                 <pic:pic>
                   <pic:nvPicPr>
-                    <pic:cNvPr id="0" name="E9_06_cobertura_suite_equipo_mas_u5.png"/>
+                    <pic:cNvPr id="0" name="E9_14_cobertura_equipo_mas_u5_20261028.png"/>
                     <pic:cNvPicPr/>
                   </pic:nvPicPr>
                   <pic:blipFill>
-                    <a:blip r:embed="rId33"/>
+                    <a:blip r:embed="rId35"/>
                     <a:stretch>
                       <a:fillRect/>
                     </a:stretch>
@@ -7987,7 +8470,7 @@
                   <pic:spPr>
                     <a:xfrm>
                       <a:off x="0" y="0"/>
-                      <a:ext cx="5940000" cy="3162640"/>
+                      <a:ext cx="5940000" cy="2894619"/>
                     </a:xfrm>
                     <a:prstGeom prst="rect"/>
                   </pic:spPr>
@@ -8008,13 +8491,13 @@
           <w:b/>
           <w:sz w:val="19"/>
         </w:rPr>
-        <w:t xml:space="preserve">Figura 16. </w:t>
+        <w:t xml:space="preserve">Figura 18. </w:t>
       </w:r>
       <w:r>
         <w:rPr>
           <w:sz w:val="19"/>
         </w:rPr>
-        <w:t>Cobertura de Eventos Nova con la suite del equipo y las pruebas U5 (E9).</w:t>
+        <w:t>Cobertura de Eventos Nova con la suite del equipo y las pruebas U5 (E9, 28/10/2026).</w:t>
       </w:r>
     </w:p>
     <w:p>
@@ -8032,17 +8515,7 @@
         <w:jc w:val="both"/>
       </w:pPr>
       <w:r>
-        <w:t xml:space="preserve">Las dos matrices completas están en el Anexo A y en los CSV del entregable. En ambas, el resultado real coincide con el esperado en todos los casos menos los dos </w:t>
-      </w:r>
-      <w:r>
-        <w:rPr>
-          <w:rFonts w:ascii="Consolas" w:hAnsi="Consolas" w:eastAsia="Consolas"/>
-          <w:sz w:val="18"/>
-        </w:rPr>
-        <w:t>xfail</w:t>
-      </w:r>
-      <w:r>
-        <w:t>, que son diferencias documentadas a propósito.</w:t>
+        <w:t>Las dos matrices completas están en los Anexos A y B y en los CSV del entregable. Los conteos de la Tabla 7 salen de la columna «Categoría» de cada CSV y los estados del JUnit XML de la ejecución final; la columna «Fecha de ejecución» de los CSV indica cuándo se obtuvo cada resultado.</w:t>
       </w:r>
     </w:p>
     <w:p>
@@ -8062,26 +8535,27 @@
         <w:rPr>
           <w:sz w:val="19"/>
         </w:rPr>
-        <w:t>Resumen de las matrices</w:t>
+        <w:t>Resumen de las matrices (28/10/2026)</w:t>
       </w:r>
     </w:p>
     <w:tbl>
       <w:tblPr>
         <w:tblStyle w:val="Tabladecuadrcula4-nfasis11"/>
-        <w:tblW w:type="dxa" w:w="9865"/>
+        <w:tblW w:type="dxa" w:w="9525"/>
         <w:jc w:val="center"/>
         <w:tblLayout w:type="fixed"/>
         <w:tblLook w:firstColumn="1" w:firstRow="1" w:lastColumn="0" w:lastRow="0" w:noHBand="0" w:noVBand="1" w:val="04A0"/>
         <w:tblLayout w:type="fixed"/>
       </w:tblPr>
       <w:tblGrid>
-        <w:gridCol w:w="3628"/>
+        <w:gridCol w:w="3175"/>
+        <w:gridCol w:w="737"/>
+        <w:gridCol w:w="737"/>
+        <w:gridCol w:w="737"/>
         <w:gridCol w:w="793"/>
         <w:gridCol w:w="793"/>
-        <w:gridCol w:w="793"/>
-        <w:gridCol w:w="793"/>
-        <w:gridCol w:w="1134"/>
-        <w:gridCol w:w="1927"/>
+        <w:gridCol w:w="1247"/>
+        <w:gridCol w:w="1304"/>
       </w:tblGrid>
       <w:tr>
         <w:trPr>
@@ -8090,7 +8564,7 @@
         </w:trPr>
         <w:tc>
           <w:tcPr>
-            <w:tcW w:type="dxa" w:w="3628"/>
+            <w:tcW w:type="dxa" w:w="3175"/>
           </w:tcPr>
           <w:p>
             <w:pPr>
@@ -8109,6 +8583,63 @@
         </w:tc>
         <w:tc>
           <w:tcPr>
+            <w:tcW w:type="dxa" w:w="737"/>
+          </w:tcPr>
+          <w:p>
+            <w:pPr>
+              <w:keepNext/>
+              <w:jc w:val="center"/>
+            </w:pPr>
+            <w:r/>
+            <w:r>
+              <w:rPr>
+                <w:b/>
+                <w:sz w:val="17"/>
+              </w:rPr>
+              <w:t>Casos</w:t>
+            </w:r>
+          </w:p>
+        </w:tc>
+        <w:tc>
+          <w:tcPr>
+            <w:tcW w:type="dxa" w:w="737"/>
+          </w:tcPr>
+          <w:p>
+            <w:pPr>
+              <w:keepNext/>
+              <w:jc w:val="center"/>
+            </w:pPr>
+            <w:r/>
+            <w:r>
+              <w:rPr>
+                <w:b/>
+                <w:sz w:val="17"/>
+              </w:rPr>
+              <w:t>Éxito</w:t>
+            </w:r>
+          </w:p>
+        </w:tc>
+        <w:tc>
+          <w:tcPr>
+            <w:tcW w:type="dxa" w:w="737"/>
+          </w:tcPr>
+          <w:p>
+            <w:pPr>
+              <w:keepNext/>
+              <w:jc w:val="center"/>
+            </w:pPr>
+            <w:r/>
+            <w:r>
+              <w:rPr>
+                <w:b/>
+                <w:sz w:val="17"/>
+              </w:rPr>
+              <w:t>Error</w:t>
+            </w:r>
+          </w:p>
+        </w:tc>
+        <w:tc>
+          <w:tcPr>
             <w:tcW w:type="dxa" w:w="794"/>
           </w:tcPr>
           <w:p>
@@ -8122,7 +8653,7 @@
                 <w:b/>
                 <w:sz w:val="17"/>
               </w:rPr>
-              <w:t>Casos</w:t>
+              <w:t>Límite</w:t>
             </w:r>
           </w:p>
         </w:tc>
@@ -8141,13 +8672,13 @@
                 <w:b/>
                 <w:sz w:val="17"/>
               </w:rPr>
-              <w:t>Éxito</w:t>
-            </w:r>
-          </w:p>
-        </w:tc>
-        <w:tc>
-          <w:tcPr>
-            <w:tcW w:type="dxa" w:w="794"/>
+              <w:t>Riesgo</w:t>
+            </w:r>
+          </w:p>
+        </w:tc>
+        <w:tc>
+          <w:tcPr>
+            <w:tcW w:type="dxa" w:w="1247"/>
           </w:tcPr>
           <w:p>
             <w:pPr>
@@ -8160,51 +8691,13 @@
                 <w:b/>
                 <w:sz w:val="17"/>
               </w:rPr>
-              <w:t>Error</w:t>
-            </w:r>
-          </w:p>
-        </w:tc>
-        <w:tc>
-          <w:tcPr>
-            <w:tcW w:type="dxa" w:w="794"/>
-          </w:tcPr>
-          <w:p>
-            <w:pPr>
-              <w:keepNext/>
-              <w:jc w:val="center"/>
-            </w:pPr>
-            <w:r/>
-            <w:r>
-              <w:rPr>
-                <w:b/>
-                <w:sz w:val="17"/>
-              </w:rPr>
-              <w:t>Límite</w:t>
-            </w:r>
-          </w:p>
-        </w:tc>
-        <w:tc>
-          <w:tcPr>
-            <w:tcW w:type="dxa" w:w="1134"/>
-          </w:tcPr>
-          <w:p>
-            <w:pPr>
-              <w:keepNext/>
-              <w:jc w:val="center"/>
-            </w:pPr>
-            <w:r/>
-            <w:r>
-              <w:rPr>
-                <w:b/>
-                <w:sz w:val="17"/>
-              </w:rPr>
               <w:t>Aprobados</w:t>
             </w:r>
           </w:p>
         </w:tc>
         <w:tc>
           <w:tcPr>
-            <w:tcW w:type="dxa" w:w="1928"/>
+            <w:tcW w:type="dxa" w:w="1304"/>
           </w:tcPr>
           <w:p>
             <w:pPr>
@@ -8228,7 +8721,7 @@
         </w:trPr>
         <w:tc>
           <w:tcPr>
-            <w:tcW w:type="dxa" w:w="3628"/>
+            <w:tcW w:type="dxa" w:w="3175"/>
           </w:tcPr>
           <w:p>
             <w:pPr>
@@ -8245,7 +8738,7 @@
             <w:r>
               <w:rPr>
                 <w:rFonts w:ascii="Consolas" w:hAnsi="Consolas" w:eastAsia="Consolas"/>
-                <w:sz w:val="18"/>
+                <w:sz w:val="17"/>
               </w:rPr>
               <w:t>matriz_pruebas_base.csv</w:t>
             </w:r>
@@ -8259,6 +8752,60 @@
         </w:tc>
         <w:tc>
           <w:tcPr>
+            <w:tcW w:type="dxa" w:w="737"/>
+          </w:tcPr>
+          <w:p>
+            <w:pPr>
+              <w:keepNext/>
+              <w:spacing w:after="20"/>
+            </w:pPr>
+            <w:r/>
+            <w:r>
+              <w:rPr>
+                <w:sz w:val="17"/>
+              </w:rPr>
+              <w:t>27</w:t>
+            </w:r>
+          </w:p>
+        </w:tc>
+        <w:tc>
+          <w:tcPr>
+            <w:tcW w:type="dxa" w:w="737"/>
+          </w:tcPr>
+          <w:p>
+            <w:pPr>
+              <w:keepNext/>
+              <w:spacing w:after="20"/>
+            </w:pPr>
+            <w:r/>
+            <w:r>
+              <w:rPr>
+                <w:sz w:val="17"/>
+              </w:rPr>
+              <w:t>8</w:t>
+            </w:r>
+          </w:p>
+        </w:tc>
+        <w:tc>
+          <w:tcPr>
+            <w:tcW w:type="dxa" w:w="737"/>
+          </w:tcPr>
+          <w:p>
+            <w:pPr>
+              <w:keepNext/>
+              <w:spacing w:after="20"/>
+            </w:pPr>
+            <w:r/>
+            <w:r>
+              <w:rPr>
+                <w:sz w:val="17"/>
+              </w:rPr>
+              <w:t>11</w:t>
+            </w:r>
+          </w:p>
+        </w:tc>
+        <w:tc>
+          <w:tcPr>
             <w:tcW w:type="dxa" w:w="794"/>
           </w:tcPr>
           <w:p>
@@ -8271,7 +8818,7 @@
               <w:rPr>
                 <w:sz w:val="17"/>
               </w:rPr>
-              <w:t>27</w:t>
+              <w:t>7</w:t>
             </w:r>
           </w:p>
         </w:tc>
@@ -8289,49 +8836,13 @@
               <w:rPr>
                 <w:sz w:val="17"/>
               </w:rPr>
-              <w:t>8</w:t>
-            </w:r>
-          </w:p>
-        </w:tc>
-        <w:tc>
-          <w:tcPr>
-            <w:tcW w:type="dxa" w:w="794"/>
-          </w:tcPr>
-          <w:p>
-            <w:pPr>
-              <w:keepNext/>
-              <w:spacing w:after="20"/>
-            </w:pPr>
-            <w:r/>
-            <w:r>
-              <w:rPr>
-                <w:sz w:val="17"/>
-              </w:rPr>
-              <w:t>12</w:t>
-            </w:r>
-          </w:p>
-        </w:tc>
-        <w:tc>
-          <w:tcPr>
-            <w:tcW w:type="dxa" w:w="794"/>
-          </w:tcPr>
-          <w:p>
-            <w:pPr>
-              <w:keepNext/>
-              <w:spacing w:after="20"/>
-            </w:pPr>
-            <w:r/>
-            <w:r>
-              <w:rPr>
-                <w:sz w:val="17"/>
-              </w:rPr>
-              <w:t>7</w:t>
-            </w:r>
-          </w:p>
-        </w:tc>
-        <w:tc>
-          <w:tcPr>
-            <w:tcW w:type="dxa" w:w="1134"/>
+              <w:t>1</w:t>
+            </w:r>
+          </w:p>
+        </w:tc>
+        <w:tc>
+          <w:tcPr>
+            <w:tcW w:type="dxa" w:w="1247"/>
           </w:tcPr>
           <w:p>
             <w:pPr>
@@ -8349,19 +8860,19 @@
         </w:tc>
         <w:tc>
           <w:tcPr>
-            <w:tcW w:type="dxa" w:w="1928"/>
-          </w:tcPr>
-          <w:p>
-            <w:pPr>
-              <w:keepNext/>
-              <w:spacing w:after="20"/>
-            </w:pPr>
-            <w:r/>
-            <w:r>
-              <w:rPr>
-                <w:sz w:val="17"/>
-              </w:rPr>
-              <w:t>1 (LAB-27, riesgo)</w:t>
+            <w:tcW w:type="dxa" w:w="1304"/>
+          </w:tcPr>
+          <w:p>
+            <w:pPr>
+              <w:keepNext/>
+              <w:spacing w:after="20"/>
+            </w:pPr>
+            <w:r/>
+            <w:r>
+              <w:rPr>
+                <w:sz w:val="17"/>
+              </w:rPr>
+              <w:t>1 (LAB-27)</w:t>
             </w:r>
           </w:p>
         </w:tc>
@@ -8372,7 +8883,7 @@
         </w:trPr>
         <w:tc>
           <w:tcPr>
-            <w:tcW w:type="dxa" w:w="3628"/>
+            <w:tcW w:type="dxa" w:w="3175"/>
           </w:tcPr>
           <w:p>
             <w:pPr>
@@ -8388,7 +8899,7 @@
             <w:r>
               <w:rPr>
                 <w:rFonts w:ascii="Consolas" w:hAnsi="Consolas" w:eastAsia="Consolas"/>
-                <w:sz w:val="18"/>
+                <w:sz w:val="17"/>
               </w:rPr>
               <w:t>matriz_pruebas_PIA.csv</w:t>
             </w:r>
@@ -8402,6 +8913,57 @@
         </w:tc>
         <w:tc>
           <w:tcPr>
+            <w:tcW w:type="dxa" w:w="737"/>
+          </w:tcPr>
+          <w:p>
+            <w:pPr>
+              <w:spacing w:after="20"/>
+            </w:pPr>
+            <w:r/>
+            <w:r>
+              <w:rPr>
+                <w:sz w:val="17"/>
+              </w:rPr>
+              <w:t>22</w:t>
+            </w:r>
+          </w:p>
+        </w:tc>
+        <w:tc>
+          <w:tcPr>
+            <w:tcW w:type="dxa" w:w="737"/>
+          </w:tcPr>
+          <w:p>
+            <w:pPr>
+              <w:spacing w:after="20"/>
+            </w:pPr>
+            <w:r/>
+            <w:r>
+              <w:rPr>
+                <w:sz w:val="17"/>
+              </w:rPr>
+              <w:t>7</w:t>
+            </w:r>
+          </w:p>
+        </w:tc>
+        <w:tc>
+          <w:tcPr>
+            <w:tcW w:type="dxa" w:w="737"/>
+          </w:tcPr>
+          <w:p>
+            <w:pPr>
+              <w:spacing w:after="20"/>
+            </w:pPr>
+            <w:r/>
+            <w:r>
+              <w:rPr>
+                <w:sz w:val="17"/>
+              </w:rPr>
+              <w:t>9</w:t>
+            </w:r>
+          </w:p>
+        </w:tc>
+        <w:tc>
+          <w:tcPr>
             <w:tcW w:type="dxa" w:w="794"/>
           </w:tcPr>
           <w:p>
@@ -8413,92 +8975,58 @@
               <w:rPr>
                 <w:sz w:val="17"/>
               </w:rPr>
+              <w:t>6</w:t>
+            </w:r>
+          </w:p>
+        </w:tc>
+        <w:tc>
+          <w:tcPr>
+            <w:tcW w:type="dxa" w:w="794"/>
+          </w:tcPr>
+          <w:p>
+            <w:pPr>
+              <w:spacing w:after="20"/>
+            </w:pPr>
+            <w:r/>
+            <w:r>
+              <w:rPr>
+                <w:sz w:val="17"/>
+              </w:rPr>
+              <w:t>0</w:t>
+            </w:r>
+          </w:p>
+        </w:tc>
+        <w:tc>
+          <w:tcPr>
+            <w:tcW w:type="dxa" w:w="1247"/>
+          </w:tcPr>
+          <w:p>
+            <w:pPr>
+              <w:spacing w:after="20"/>
+            </w:pPr>
+            <w:r/>
+            <w:r>
+              <w:rPr>
+                <w:sz w:val="17"/>
+              </w:rPr>
               <w:t>22</w:t>
             </w:r>
           </w:p>
         </w:tc>
         <w:tc>
           <w:tcPr>
-            <w:tcW w:type="dxa" w:w="794"/>
-          </w:tcPr>
-          <w:p>
-            <w:pPr>
-              <w:spacing w:after="20"/>
-            </w:pPr>
-            <w:r/>
-            <w:r>
-              <w:rPr>
-                <w:sz w:val="17"/>
-              </w:rPr>
-              <w:t>7</w:t>
-            </w:r>
-          </w:p>
-        </w:tc>
-        <w:tc>
-          <w:tcPr>
-            <w:tcW w:type="dxa" w:w="794"/>
-          </w:tcPr>
-          <w:p>
-            <w:pPr>
-              <w:spacing w:after="20"/>
-            </w:pPr>
-            <w:r/>
-            <w:r>
-              <w:rPr>
-                <w:sz w:val="17"/>
-              </w:rPr>
-              <w:t>9</w:t>
-            </w:r>
-          </w:p>
-        </w:tc>
-        <w:tc>
-          <w:tcPr>
-            <w:tcW w:type="dxa" w:w="794"/>
-          </w:tcPr>
-          <w:p>
-            <w:pPr>
-              <w:spacing w:after="20"/>
-            </w:pPr>
-            <w:r/>
-            <w:r>
-              <w:rPr>
-                <w:sz w:val="17"/>
-              </w:rPr>
-              <w:t>6</w:t>
-            </w:r>
-          </w:p>
-        </w:tc>
-        <w:tc>
-          <w:tcPr>
-            <w:tcW w:type="dxa" w:w="1134"/>
-          </w:tcPr>
-          <w:p>
-            <w:pPr>
-              <w:spacing w:after="20"/>
-            </w:pPr>
-            <w:r/>
-            <w:r>
-              <w:rPr>
-                <w:sz w:val="17"/>
-              </w:rPr>
-              <w:t>21</w:t>
-            </w:r>
-          </w:p>
-        </w:tc>
-        <w:tc>
-          <w:tcPr>
-            <w:tcW w:type="dxa" w:w="1928"/>
-          </w:tcPr>
-          <w:p>
-            <w:pPr>
-              <w:spacing w:after="20"/>
-            </w:pPr>
-            <w:r/>
-            <w:r>
-              <w:rPr>
-                <w:sz w:val="17"/>
-              </w:rPr>
-              <w:t>1 (PIA-03b, hallazgo)</w:t>
+            <w:tcW w:type="dxa" w:w="1304"/>
+          </w:tcPr>
+          <w:p>
+            <w:pPr>
+              <w:spacing w:after="20"/>
+            </w:pPr>
+            <w:r/>
+            <w:r>
+              <w:rPr>
+                <w:sz w:val="17"/>
+              </w:rPr>
+              <w:t>0</w:t>
             </w:r>
           </w:p>
         </w:tc>
@@ -8516,7 +9044,26 @@
         <w:jc w:val="both"/>
       </w:pPr>
       <w:r>
-        <w:t>En la matriz de Eventos Nova, PIA-20 cuenta como error porque empieza con un rechazo del verificador y termina en éxito; las demás categorías siguen la columna «Categoría» del CSV.</w:t>
+        <w:t xml:space="preserve">En la matriz del laboratorio, LAB-27 es un </w:t>
+      </w:r>
+      <w:r>
+        <w:rPr>
+          <w:b/>
+        </w:rPr>
+        <w:t>riesgo documentado</w:t>
+      </w:r>
+      <w:r>
+        <w:t xml:space="preserve">, una categoría propia que no se suma a los errores: es la única prueba cuyo resultado real no coincide con el esperado, y no coincide a propósito, porque expresa el comportamiento deseable que el código todavía no tiene. Los mínimos del laboratorio (5 éxito, 4 error, 3 límite) se cumplen sin contarla. En la versión 1 de este reporte se había sumado a los errores (12); se corrigió. En la matriz de Eventos Nova, PIA-03b pasó de </w:t>
+      </w:r>
+      <w:r>
+        <w:rPr>
+          <w:rFonts w:ascii="Consolas" w:hAnsi="Consolas" w:eastAsia="Consolas"/>
+          <w:sz w:val="18"/>
+        </w:rPr>
+        <w:t>xfail</w:t>
+      </w:r>
+      <w:r>
+        <w:t xml:space="preserve"> a aprobada con la corrección U5-H1, y PIA-20, que antes figuraba como «Error → Éxito», se clasifica como error porque su objetivo es el rechazo del verificador.</w:t>
       </w:r>
     </w:p>
     <w:p>
@@ -8544,7 +9091,17 @@
         <w:t>evidencias/</w:t>
       </w:r>
       <w:r>
-        <w:t xml:space="preserve"> el registro de texto con fecha, comando y código de salida, y su imagen. Las imágenes de terminal se generaron a partir de esos registros sin cambiar el texto; las de cobertura HTML son capturas del navegador.</w:t>
+        <w:t xml:space="preserve"> el registro de texto con fecha, comando y código de salida, y su imagen. Las imágenes de terminal se generaron a partir de esos registros sin cambiar el texto; las de cobertura HTML son capturas del navegador. Los registros del 27/10 se conservan; los de la revisión del 28/10 tienen </w:t>
+      </w:r>
+      <w:r>
+        <w:rPr>
+          <w:rFonts w:ascii="Consolas" w:hAnsi="Consolas" w:eastAsia="Consolas"/>
+          <w:sz w:val="18"/>
+        </w:rPr>
+        <w:t>20261028</w:t>
+      </w:r>
+      <w:r>
+        <w:t xml:space="preserve"> en el nombre.</w:t>
       </w:r>
     </w:p>
     <w:p>
@@ -8757,7 +9314,7 @@
             <w:r>
               <w:rPr>
                 <w:rFonts w:ascii="Consolas" w:hAnsi="Consolas" w:eastAsia="Consolas"/>
-                <w:sz w:val="18"/>
+                <w:sz w:val="16"/>
               </w:rPr>
               <w:t>python -m pytest -v</w:t>
             </w:r>
@@ -8788,7 +9345,7 @@
             <w:r>
               <w:rPr>
                 <w:rFonts w:ascii="Consolas" w:hAnsi="Consolas" w:eastAsia="Consolas"/>
-                <w:sz w:val="18"/>
+                <w:sz w:val="16"/>
               </w:rPr>
               <w:t>pytest</w:t>
             </w:r>
@@ -8796,7 +9353,7 @@
               <w:rPr>
                 <w:sz w:val="16"/>
               </w:rPr>
-              <w:t xml:space="preserve"> directo</w:t>
+              <w:t xml:space="preserve"> directo. Revalidación 28/10: 69 + 1 xfail</w:t>
             </w:r>
           </w:p>
         </w:tc>
@@ -8890,7 +9447,7 @@
             <w:r>
               <w:rPr>
                 <w:rFonts w:ascii="Consolas" w:hAnsi="Consolas" w:eastAsia="Consolas"/>
-                <w:sz w:val="18"/>
+                <w:sz w:val="16"/>
               </w:rPr>
               <w:t>pytest tests/test_order.py</w:t>
             </w:r>
@@ -8903,7 +9460,7 @@
             <w:r>
               <w:rPr>
                 <w:rFonts w:ascii="Consolas" w:hAnsi="Consolas" w:eastAsia="Consolas"/>
-                <w:sz w:val="18"/>
+                <w:sz w:val="16"/>
               </w:rPr>
               <w:t>test_casos_csv.py</w:t>
             </w:r>
@@ -9041,7 +9598,7 @@
             <w:r>
               <w:rPr>
                 <w:rFonts w:ascii="Consolas" w:hAnsi="Consolas" w:eastAsia="Consolas"/>
-                <w:sz w:val="18"/>
+                <w:sz w:val="16"/>
               </w:rPr>
               <w:t>DID NOT RAISE</w:t>
             </w:r>
@@ -9143,10 +9700,16 @@
             <w:r>
               <w:rPr>
                 <w:rFonts w:ascii="Consolas" w:hAnsi="Consolas" w:eastAsia="Consolas"/>
-                <w:sz w:val="18"/>
+                <w:sz w:val="16"/>
               </w:rPr>
               <w:t>pytest tests/test_repository.py</w:t>
             </w:r>
+            <w:r>
+              <w:rPr>
+                <w:sz w:val="16"/>
+              </w:rPr>
+              <w:t>; prueba temporal con fuga</w:t>
+            </w:r>
           </w:p>
         </w:tc>
         <w:tc>
@@ -9163,7 +9726,7 @@
               <w:rPr>
                 <w:sz w:val="16"/>
               </w:rPr>
-              <w:t>8/8</w:t>
+              <w:t>8/8; una conexión sin cerrar hace fallar la suite</w:t>
             </w:r>
           </w:p>
         </w:tc>
@@ -9257,10 +9820,23 @@
             <w:r>
               <w:rPr>
                 <w:rFonts w:ascii="Consolas" w:hAnsi="Consolas" w:eastAsia="Consolas"/>
-                <w:sz w:val="18"/>
+                <w:sz w:val="16"/>
               </w:rPr>
               <w:t>pytest tests/test_service.py -rxX</w:t>
             </w:r>
+            <w:r>
+              <w:rPr>
+                <w:sz w:val="16"/>
+              </w:rPr>
+              <w:t xml:space="preserve">; </w:t>
+            </w:r>
+            <w:r>
+              <w:rPr>
+                <w:rFonts w:ascii="Consolas" w:hAnsi="Consolas" w:eastAsia="Consolas"/>
+                <w:sz w:val="16"/>
+              </w:rPr>
+              <w:t>--runxfail</w:t>
+            </w:r>
           </w:p>
         </w:tc>
         <w:tc>
@@ -9277,7 +9853,7 @@
               <w:rPr>
                 <w:sz w:val="16"/>
               </w:rPr>
-              <w:t>7 aprobadas, 1 xfail</w:t>
+              <w:t>7 aprobadas, 1 xfail con su causa verificada</w:t>
             </w:r>
           </w:p>
         </w:tc>
@@ -9371,7 +9947,7 @@
             <w:r>
               <w:rPr>
                 <w:rFonts w:ascii="Consolas" w:hAnsi="Consolas" w:eastAsia="Consolas"/>
-                <w:sz w:val="18"/>
+                <w:sz w:val="16"/>
               </w:rPr>
               <w:t>pytest tests/test_security.py</w:t>
             </w:r>
@@ -9486,7 +10062,7 @@
               <w:rPr>
                 <w:sz w:val="16"/>
               </w:rPr>
-              <w:t>Ruff, pytest-cov, compileall</w:t>
+              <w:t>Ruff, pytest-cov, compileall (27/10 y 28/10)</w:t>
             </w:r>
           </w:p>
         </w:tc>
@@ -9708,8 +10284,14 @@
             <w:r/>
             <w:r>
               <w:rPr>
+                <w:sz w:val="16"/>
+              </w:rPr>
+              <w:t xml:space="preserve">Diagnóstico v1; RED/GREEN U5-H1; </w:t>
+            </w:r>
+            <w:r>
+              <w:rPr>
                 <w:rFonts w:ascii="Consolas" w:hAnsi="Consolas" w:eastAsia="Consolas"/>
-                <w:sz w:val="18"/>
+                <w:sz w:val="16"/>
               </w:rPr>
               <w:t>pytest tests_u5</w:t>
             </w:r>
@@ -9717,7 +10299,7 @@
               <w:rPr>
                 <w:sz w:val="16"/>
               </w:rPr>
-              <w:t>; cobertura combinada</w:t>
+              <w:t>; suite del equipo; cobertura combinada</w:t>
             </w:r>
           </w:p>
         </w:tc>
@@ -9734,7 +10316,7 @@
               <w:rPr>
                 <w:sz w:val="16"/>
               </w:rPr>
-              <w:t>21 + 1 xfail; 98.82 %</w:t>
+              <w:t>22/22; 1 306 del equipo con 1 fallo de entorno; 98.83 %</w:t>
             </w:r>
           </w:p>
         </w:tc>
@@ -9768,7 +10350,7 @@
               <w:rPr>
                 <w:sz w:val="16"/>
               </w:rPr>
-              <w:t>Completa (local)</w:t>
+              <w:t>Completa (local); integración al repositorio del equipo pendiente</w:t>
             </w:r>
           </w:p>
         </w:tc>
@@ -9790,7 +10372,7 @@
         <w:drawing>
           <wp:inline xmlns:a="http://schemas.openxmlformats.org/drawingml/2006/main" xmlns:pic="http://schemas.openxmlformats.org/drawingml/2006/picture">
             <wp:extent cx="5580000" cy="1195939"/>
-            <wp:docPr id="17" name="Picture 17"/>
+            <wp:docPr id="19" name="Picture 19"/>
             <wp:cNvGraphicFramePr>
               <a:graphicFrameLocks noChangeAspect="1"/>
             </wp:cNvGraphicFramePr>
@@ -9802,7 +10384,7 @@
                     <pic:cNvPicPr/>
                   </pic:nvPicPr>
                   <pic:blipFill>
-                    <a:blip r:embed="rId34"/>
+                    <a:blip r:embed="rId36"/>
                     <a:stretch>
                       <a:fillRect/>
                     </a:stretch>
@@ -9831,7 +10413,7 @@
           <w:b/>
           <w:sz w:val="19"/>
         </w:rPr>
-        <w:t xml:space="preserve">Figura 17. </w:t>
+        <w:t xml:space="preserve">Figura 19. </w:t>
       </w:r>
       <w:r>
         <w:rPr>
@@ -9850,7 +10432,7 @@
         <w:drawing>
           <wp:inline xmlns:a="http://schemas.openxmlformats.org/drawingml/2006/main" xmlns:pic="http://schemas.openxmlformats.org/drawingml/2006/picture">
             <wp:extent cx="5580000" cy="2634213"/>
-            <wp:docPr id="18" name="Picture 18"/>
+            <wp:docPr id="20" name="Picture 20"/>
             <wp:cNvGraphicFramePr>
               <a:graphicFrameLocks noChangeAspect="1"/>
             </wp:cNvGraphicFramePr>
@@ -9862,7 +10444,7 @@
                     <pic:cNvPicPr/>
                   </pic:nvPicPr>
                   <pic:blipFill>
-                    <a:blip r:embed="rId35"/>
+                    <a:blip r:embed="rId37"/>
                     <a:stretch>
                       <a:fillRect/>
                     </a:stretch>
@@ -9891,7 +10473,7 @@
           <w:b/>
           <w:sz w:val="19"/>
         </w:rPr>
-        <w:t xml:space="preserve">Figura 18. </w:t>
+        <w:t xml:space="preserve">Figura 20. </w:t>
       </w:r>
       <w:r>
         <w:rPr>
@@ -9910,7 +10492,7 @@
         <w:drawing>
           <wp:inline xmlns:a="http://schemas.openxmlformats.org/drawingml/2006/main" xmlns:pic="http://schemas.openxmlformats.org/drawingml/2006/picture">
             <wp:extent cx="5580000" cy="1365888"/>
-            <wp:docPr id="19" name="Picture 19"/>
+            <wp:docPr id="21" name="Picture 21"/>
             <wp:cNvGraphicFramePr>
               <a:graphicFrameLocks noChangeAspect="1"/>
             </wp:cNvGraphicFramePr>
@@ -9922,7 +10504,7 @@
                     <pic:cNvPicPr/>
                   </pic:nvPicPr>
                   <pic:blipFill>
-                    <a:blip r:embed="rId36"/>
+                    <a:blip r:embed="rId38"/>
                     <a:stretch>
                       <a:fillRect/>
                     </a:stretch>
@@ -9951,7 +10533,7 @@
           <w:b/>
           <w:sz w:val="19"/>
         </w:rPr>
-        <w:t xml:space="preserve">Figura 19. </w:t>
+        <w:t xml:space="preserve">Figura 21. </w:t>
       </w:r>
       <w:r>
         <w:rPr>
@@ -9970,7 +10552,7 @@
         <w:drawing>
           <wp:inline xmlns:a="http://schemas.openxmlformats.org/drawingml/2006/main" xmlns:pic="http://schemas.openxmlformats.org/drawingml/2006/picture">
             <wp:extent cx="4860000" cy="3122550"/>
-            <wp:docPr id="20" name="Picture 20"/>
+            <wp:docPr id="22" name="Picture 22"/>
             <wp:cNvGraphicFramePr>
               <a:graphicFrameLocks noChangeAspect="1"/>
             </wp:cNvGraphicFramePr>
@@ -9982,7 +10564,7 @@
                     <pic:cNvPicPr/>
                   </pic:nvPicPr>
                   <pic:blipFill>
-                    <a:blip r:embed="rId37"/>
+                    <a:blip r:embed="rId39"/>
                     <a:stretch>
                       <a:fillRect/>
                     </a:stretch>
@@ -10011,7 +10593,7 @@
           <w:b/>
           <w:sz w:val="19"/>
         </w:rPr>
-        <w:t xml:space="preserve">Figura 20. </w:t>
+        <w:t xml:space="preserve">Figura 22. </w:t>
       </w:r>
       <w:r>
         <w:rPr>
@@ -10043,7 +10625,7 @@
         <w:drawing>
           <wp:inline xmlns:a="http://schemas.openxmlformats.org/drawingml/2006/main" xmlns:pic="http://schemas.openxmlformats.org/drawingml/2006/picture">
             <wp:extent cx="5580000" cy="1025990"/>
-            <wp:docPr id="21" name="Picture 21"/>
+            <wp:docPr id="23" name="Picture 23"/>
             <wp:cNvGraphicFramePr>
               <a:graphicFrameLocks noChangeAspect="1"/>
             </wp:cNvGraphicFramePr>
@@ -10055,7 +10637,7 @@
                     <pic:cNvPicPr/>
                   </pic:nvPicPr>
                   <pic:blipFill>
-                    <a:blip r:embed="rId38"/>
+                    <a:blip r:embed="rId40"/>
                     <a:stretch>
                       <a:fillRect/>
                     </a:stretch>
@@ -10084,7 +10666,7 @@
           <w:b/>
           <w:sz w:val="19"/>
         </w:rPr>
-        <w:t xml:space="preserve">Figura 21. </w:t>
+        <w:t xml:space="preserve">Figura 23. </w:t>
       </w:r>
       <w:r>
         <w:rPr>
@@ -10102,8 +10684,8 @@
       <w:r>
         <w:drawing>
           <wp:inline xmlns:a="http://schemas.openxmlformats.org/drawingml/2006/main" xmlns:pic="http://schemas.openxmlformats.org/drawingml/2006/picture">
-            <wp:extent cx="5400000" cy="3375000"/>
-            <wp:docPr id="22" name="Picture 22"/>
+            <wp:extent cx="5580000" cy="1365888"/>
+            <wp:docPr id="24" name="Picture 24"/>
             <wp:cNvGraphicFramePr>
               <a:graphicFrameLocks noChangeAspect="1"/>
             </wp:cNvGraphicFramePr>
@@ -10111,11 +10693,11 @@
               <a:graphicData uri="http://schemas.openxmlformats.org/drawingml/2006/picture">
                 <pic:pic>
                   <pic:nvPicPr>
-                    <pic:cNvPr id="0" name="E9_07_htmlcov_u5_index.png"/>
+                    <pic:cNvPr id="0" name="E4_02_deteccion_conexion_sin_cerrar_20261028_l1-12.png"/>
                     <pic:cNvPicPr/>
                   </pic:nvPicPr>
                   <pic:blipFill>
-                    <a:blip r:embed="rId39"/>
+                    <a:blip r:embed="rId41"/>
                     <a:stretch>
                       <a:fillRect/>
                     </a:stretch>
@@ -10123,7 +10705,7 @@
                   <pic:spPr>
                     <a:xfrm>
                       <a:off x="0" y="0"/>
-                      <a:ext cx="5400000" cy="3375000"/>
+                      <a:ext cx="5580000" cy="1365888"/>
                     </a:xfrm>
                     <a:prstGeom prst="rect"/>
                   </pic:spPr>
@@ -10144,13 +10726,279 @@
           <w:b/>
           <w:sz w:val="19"/>
         </w:rPr>
-        <w:t xml:space="preserve">Figura 22. </w:t>
+        <w:t xml:space="preserve">Figura 24. </w:t>
       </w:r>
       <w:r>
         <w:rPr>
           <w:sz w:val="19"/>
         </w:rPr>
-        <w:t>E9: reporte HTML de cobertura de las pruebas U5 sobre Eventos Nova.</w:t>
+        <w:t>E4: una prueba temporal que no libera el motor SQLite hace fallar la suite (28/10/2026).</w:t>
+      </w:r>
+    </w:p>
+    <w:p>
+      <w:pPr>
+        <w:keepNext/>
+        <w:spacing w:before="120"/>
+        <w:jc w:val="center"/>
+      </w:pPr>
+      <w:r>
+        <w:drawing>
+          <wp:inline xmlns:a="http://schemas.openxmlformats.org/drawingml/2006/main" xmlns:pic="http://schemas.openxmlformats.org/drawingml/2006/picture">
+            <wp:extent cx="5580000" cy="2124365"/>
+            <wp:docPr id="25" name="Picture 25"/>
+            <wp:cNvGraphicFramePr>
+              <a:graphicFrameLocks noChangeAspect="1"/>
+            </wp:cNvGraphicFramePr>
+            <a:graphic>
+              <a:graphicData uri="http://schemas.openxmlformats.org/drawingml/2006/picture">
+                <pic:pic>
+                  <pic:nvPicPr>
+                    <pic:cNvPr id="0" name="E5_02_causa_xfail_runxfail_20261028.png"/>
+                    <pic:cNvPicPr/>
+                  </pic:nvPicPr>
+                  <pic:blipFill>
+                    <a:blip r:embed="rId42"/>
+                    <a:stretch>
+                      <a:fillRect/>
+                    </a:stretch>
+                  </pic:blipFill>
+                  <pic:spPr>
+                    <a:xfrm>
+                      <a:off x="0" y="0"/>
+                      <a:ext cx="5580000" cy="2124365"/>
+                    </a:xfrm>
+                    <a:prstGeom prst="rect"/>
+                  </pic:spPr>
+                </pic:pic>
+              </a:graphicData>
+            </a:graphic>
+          </wp:inline>
+        </w:drawing>
+      </w:r>
+    </w:p>
+    <w:p>
+      <w:pPr>
+        <w:spacing w:before="80" w:after="120" w:line="276" w:lineRule="auto"/>
+        <w:jc w:val="center"/>
+      </w:pPr>
+      <w:r>
+        <w:rPr>
+          <w:b/>
+          <w:sz w:val="19"/>
+        </w:rPr>
+        <w:t xml:space="preserve">Figura 25. </w:t>
+      </w:r>
+      <w:r>
+        <w:rPr>
+          <w:sz w:val="19"/>
+        </w:rPr>
+        <w:t xml:space="preserve">E5: con </w:t>
+      </w:r>
+      <w:r>
+        <w:rPr>
+          <w:rFonts w:ascii="Consolas" w:hAnsi="Consolas" w:eastAsia="Consolas"/>
+          <w:sz w:val="18"/>
+        </w:rPr>
+        <w:t>--runxfail</w:t>
+      </w:r>
+      <w:r>
+        <w:rPr>
+          <w:sz w:val="19"/>
+        </w:rPr>
+        <w:t>, LAB-27 falla en la aserción del estado, la causa documentada (28/10/2026).</w:t>
+      </w:r>
+    </w:p>
+    <w:p>
+      <w:pPr>
+        <w:keepNext/>
+        <w:spacing w:before="120"/>
+        <w:jc w:val="center"/>
+      </w:pPr>
+      <w:r>
+        <w:drawing>
+          <wp:inline xmlns:a="http://schemas.openxmlformats.org/drawingml/2006/main" xmlns:pic="http://schemas.openxmlformats.org/drawingml/2006/picture">
+            <wp:extent cx="5580000" cy="1365888"/>
+            <wp:docPr id="26" name="Picture 26"/>
+            <wp:cNvGraphicFramePr>
+              <a:graphicFrameLocks noChangeAspect="1"/>
+            </wp:cNvGraphicFramePr>
+            <a:graphic>
+              <a:graphicData uri="http://schemas.openxmlformats.org/drawingml/2006/picture">
+                <pic:pic>
+                  <pic:nvPicPr>
+                    <pic:cNvPr id="0" name="E9_12_U5H1_GREEN_20261028.png"/>
+                    <pic:cNvPicPr/>
+                  </pic:nvPicPr>
+                  <pic:blipFill>
+                    <a:blip r:embed="rId43"/>
+                    <a:stretch>
+                      <a:fillRect/>
+                    </a:stretch>
+                  </pic:blipFill>
+                  <pic:spPr>
+                    <a:xfrm>
+                      <a:off x="0" y="0"/>
+                      <a:ext cx="5580000" cy="1365888"/>
+                    </a:xfrm>
+                    <a:prstGeom prst="rect"/>
+                  </pic:spPr>
+                </pic:pic>
+              </a:graphicData>
+            </a:graphic>
+          </wp:inline>
+        </w:drawing>
+      </w:r>
+    </w:p>
+    <w:p>
+      <w:pPr>
+        <w:spacing w:before="80" w:after="120" w:line="276" w:lineRule="auto"/>
+        <w:jc w:val="center"/>
+      </w:pPr>
+      <w:r>
+        <w:rPr>
+          <w:b/>
+          <w:sz w:val="19"/>
+        </w:rPr>
+        <w:t xml:space="preserve">Figura 26. </w:t>
+      </w:r>
+      <w:r>
+        <w:rPr>
+          <w:sz w:val="19"/>
+        </w:rPr>
+        <w:t>E9: GREEN de U5-H1 tras la corrección (28/10/2026).</w:t>
+      </w:r>
+    </w:p>
+    <w:p>
+      <w:pPr>
+        <w:keepNext/>
+        <w:spacing w:before="120"/>
+        <w:jc w:val="center"/>
+      </w:pPr>
+      <w:r>
+        <w:drawing>
+          <wp:inline xmlns:a="http://schemas.openxmlformats.org/drawingml/2006/main" xmlns:pic="http://schemas.openxmlformats.org/drawingml/2006/picture">
+            <wp:extent cx="5940000" cy="1273096"/>
+            <wp:docPr id="27" name="Picture 27"/>
+            <wp:cNvGraphicFramePr>
+              <a:graphicFrameLocks noChangeAspect="1"/>
+            </wp:cNvGraphicFramePr>
+            <a:graphic>
+              <a:graphicData uri="http://schemas.openxmlformats.org/drawingml/2006/picture">
+                <pic:pic>
+                  <pic:nvPicPr>
+                    <pic:cNvPr id="0" name="E9_18_mensaje_si_falta_codigo_PIA_20261028.png"/>
+                    <pic:cNvPicPr/>
+                  </pic:nvPicPr>
+                  <pic:blipFill>
+                    <a:blip r:embed="rId44"/>
+                    <a:stretch>
+                      <a:fillRect/>
+                    </a:stretch>
+                  </pic:blipFill>
+                  <pic:spPr>
+                    <a:xfrm>
+                      <a:off x="0" y="0"/>
+                      <a:ext cx="5940000" cy="1273096"/>
+                    </a:xfrm>
+                    <a:prstGeom prst="rect"/>
+                  </pic:spPr>
+                </pic:pic>
+              </a:graphicData>
+            </a:graphic>
+          </wp:inline>
+        </w:drawing>
+      </w:r>
+    </w:p>
+    <w:p>
+      <w:pPr>
+        <w:spacing w:before="80" w:after="120" w:line="276" w:lineRule="auto"/>
+        <w:jc w:val="center"/>
+      </w:pPr>
+      <w:r>
+        <w:rPr>
+          <w:b/>
+          <w:sz w:val="19"/>
+        </w:rPr>
+        <w:t xml:space="preserve">Figura 27. </w:t>
+      </w:r>
+      <w:r>
+        <w:rPr>
+          <w:sz w:val="19"/>
+        </w:rPr>
+        <w:t xml:space="preserve">E9: si </w:t>
+      </w:r>
+      <w:r>
+        <w:rPr>
+          <w:rFonts w:ascii="Consolas" w:hAnsi="Consolas" w:eastAsia="Consolas"/>
+          <w:sz w:val="18"/>
+        </w:rPr>
+        <w:t>tests_u5</w:t>
+      </w:r>
+      <w:r>
+        <w:rPr>
+          <w:sz w:val="19"/>
+        </w:rPr>
+        <w:t xml:space="preserve"> se ejecuta sin el código del PIA, ahora se detiene con un mensaje que explica qué falta (28/10/2026).</w:t>
+      </w:r>
+    </w:p>
+    <w:p>
+      <w:pPr>
+        <w:keepNext/>
+        <w:spacing w:before="120"/>
+        <w:jc w:val="center"/>
+      </w:pPr>
+      <w:r>
+        <w:drawing>
+          <wp:inline xmlns:a="http://schemas.openxmlformats.org/drawingml/2006/main" xmlns:pic="http://schemas.openxmlformats.org/drawingml/2006/picture">
+            <wp:extent cx="5400000" cy="3796875"/>
+            <wp:docPr id="28" name="Picture 28"/>
+            <wp:cNvGraphicFramePr>
+              <a:graphicFrameLocks noChangeAspect="1"/>
+            </wp:cNvGraphicFramePr>
+            <a:graphic>
+              <a:graphicData uri="http://schemas.openxmlformats.org/drawingml/2006/picture">
+                <pic:pic>
+                  <pic:nvPicPr>
+                    <pic:cNvPr id="0" name="E9_19_htmlcov_u5_index_20261028.png"/>
+                    <pic:cNvPicPr/>
+                  </pic:nvPicPr>
+                  <pic:blipFill>
+                    <a:blip r:embed="rId45"/>
+                    <a:stretch>
+                      <a:fillRect/>
+                    </a:stretch>
+                  </pic:blipFill>
+                  <pic:spPr>
+                    <a:xfrm>
+                      <a:off x="0" y="0"/>
+                      <a:ext cx="5400000" cy="3796875"/>
+                    </a:xfrm>
+                    <a:prstGeom prst="rect"/>
+                  </pic:spPr>
+                </pic:pic>
+              </a:graphicData>
+            </a:graphic>
+          </wp:inline>
+        </w:drawing>
+      </w:r>
+    </w:p>
+    <w:p>
+      <w:pPr>
+        <w:spacing w:before="80" w:after="120" w:line="276" w:lineRule="auto"/>
+        <w:jc w:val="center"/>
+      </w:pPr>
+      <w:r>
+        <w:rPr>
+          <w:b/>
+          <w:sz w:val="19"/>
+        </w:rPr>
+        <w:t xml:space="preserve">Figura 28. </w:t>
+      </w:r>
+      <w:r>
+        <w:rPr>
+          <w:sz w:val="19"/>
+        </w:rPr>
+        <w:t>E9: reporte HTML de cobertura de las pruebas U5 sobre Eventos Nova (28/10/2026).</w:t>
       </w:r>
     </w:p>
     <w:p>
@@ -10314,7 +11162,7 @@
             <w:r>
               <w:rPr>
                 <w:rFonts w:ascii="Consolas" w:hAnsi="Consolas" w:eastAsia="Consolas"/>
-                <w:sz w:val="18"/>
+                <w:sz w:val="16"/>
               </w:rPr>
               <w:t>pytest</w:t>
             </w:r>
@@ -10327,7 +11175,7 @@
             <w:r>
               <w:rPr>
                 <w:rFonts w:ascii="Consolas" w:hAnsi="Consolas" w:eastAsia="Consolas"/>
-                <w:sz w:val="18"/>
+                <w:sz w:val="16"/>
               </w:rPr>
               <w:t>python -m</w:t>
             </w:r>
@@ -10340,7 +11188,7 @@
             <w:r>
               <w:rPr>
                 <w:rFonts w:ascii="Consolas" w:hAnsi="Consolas" w:eastAsia="Consolas"/>
-                <w:sz w:val="18"/>
+                <w:sz w:val="16"/>
               </w:rPr>
               <w:t>src</w:t>
             </w:r>
@@ -10365,7 +11213,7 @@
             <w:r>
               <w:rPr>
                 <w:rFonts w:ascii="Consolas" w:hAnsi="Consolas" w:eastAsia="Consolas"/>
-                <w:sz w:val="18"/>
+                <w:sz w:val="16"/>
               </w:rPr>
               <w:t>sys.path</w:t>
             </w:r>
@@ -10384,7 +11232,7 @@
             <w:r>
               <w:rPr>
                 <w:rFonts w:ascii="Consolas" w:hAnsi="Consolas" w:eastAsia="Consolas"/>
-                <w:sz w:val="18"/>
+                <w:sz w:val="16"/>
               </w:rPr>
               <w:t>pythonpath = ["."]</w:t>
             </w:r>
@@ -10397,7 +11245,7 @@
             <w:r>
               <w:rPr>
                 <w:rFonts w:ascii="Consolas" w:hAnsi="Consolas" w:eastAsia="Consolas"/>
-                <w:sz w:val="18"/>
+                <w:sz w:val="16"/>
               </w:rPr>
               <w:t>pyproject.toml</w:t>
             </w:r>
@@ -10457,7 +11305,7 @@
             <w:r>
               <w:rPr>
                 <w:rFonts w:ascii="Consolas" w:hAnsi="Consolas" w:eastAsia="Consolas"/>
-                <w:sz w:val="18"/>
+                <w:sz w:val="16"/>
               </w:rPr>
               <w:t>ruff&gt;=0.6</w:t>
             </w:r>
@@ -10482,7 +11330,7 @@
             <w:r>
               <w:rPr>
                 <w:rFonts w:ascii="Consolas" w:hAnsi="Consolas" w:eastAsia="Consolas"/>
-                <w:sz w:val="18"/>
+                <w:sz w:val="16"/>
               </w:rPr>
               <w:t>ruff check --fix</w:t>
             </w:r>
@@ -10530,7 +11378,7 @@
             <w:r>
               <w:rPr>
                 <w:rFonts w:ascii="Consolas" w:hAnsi="Consolas" w:eastAsia="Consolas"/>
-                <w:sz w:val="18"/>
+                <w:sz w:val="16"/>
               </w:rPr>
               <w:t>ResourceWarning</w:t>
             </w:r>
@@ -10579,7 +11427,7 @@
             <w:r>
               <w:rPr>
                 <w:rFonts w:ascii="Consolas" w:hAnsi="Consolas" w:eastAsia="Consolas"/>
-                <w:sz w:val="18"/>
+                <w:sz w:val="16"/>
               </w:rPr>
               <w:t>dispose()</w:t>
             </w:r>
@@ -10710,7 +11558,7 @@
             <w:r>
               <w:rPr>
                 <w:rFonts w:ascii="Consolas" w:hAnsi="Consolas" w:eastAsia="Consolas"/>
-                <w:sz w:val="18"/>
+                <w:sz w:val="16"/>
               </w:rPr>
               <w:t>DTZ001</w:t>
             </w:r>
@@ -10723,7 +11571,7 @@
             <w:r>
               <w:rPr>
                 <w:rFonts w:ascii="Consolas" w:hAnsi="Consolas" w:eastAsia="Consolas"/>
-                <w:sz w:val="18"/>
+                <w:sz w:val="16"/>
               </w:rPr>
               <w:t>tests_u5</w:t>
             </w:r>
@@ -10760,7 +11608,7 @@
             <w:r>
               <w:rPr>
                 <w:rFonts w:ascii="Consolas" w:hAnsi="Consolas" w:eastAsia="Consolas"/>
-                <w:sz w:val="18"/>
+                <w:sz w:val="16"/>
               </w:rPr>
               <w:t>tests_u5/ruff.toml</w:t>
             </w:r>
@@ -10808,7 +11656,7 @@
             <w:r>
               <w:rPr>
                 <w:rFonts w:ascii="Consolas" w:hAnsi="Consolas" w:eastAsia="Consolas"/>
-                <w:sz w:val="18"/>
+                <w:sz w:val="16"/>
               </w:rPr>
               <w:t>test_openapi_exportada</w:t>
             </w:r>
@@ -10839,7 +11687,7 @@
             <w:r>
               <w:rPr>
                 <w:rFonts w:ascii="Consolas" w:hAnsi="Consolas" w:eastAsia="Consolas"/>
-                <w:sz w:val="18"/>
+                <w:sz w:val="16"/>
               </w:rPr>
               <w:t>pattern</w:t>
             </w:r>
@@ -10888,7 +11736,7 @@
               <w:rPr>
                 <w:sz w:val="16"/>
               </w:rPr>
-              <w:t>U5-H1</w:t>
+              <w:t>I-06</w:t>
             </w:r>
           </w:p>
         </w:tc>
@@ -10906,7 +11754,33 @@
               <w:rPr>
                 <w:sz w:val="16"/>
               </w:rPr>
-              <w:t>Se consulta a proveedores con una solicitud ya No procedente</w:t>
+              <w:t xml:space="preserve">El ZIP v1 no ejecutaba </w:t>
+            </w:r>
+            <w:r>
+              <w:rPr>
+                <w:rFonts w:ascii="Consolas" w:hAnsi="Consolas" w:eastAsia="Consolas"/>
+                <w:sz w:val="16"/>
+              </w:rPr>
+              <w:t>tests_u5</w:t>
+            </w:r>
+            <w:r>
+              <w:rPr>
+                <w:sz w:val="16"/>
+              </w:rPr>
+              <w:t xml:space="preserve"> (</w:t>
+            </w:r>
+            <w:r>
+              <w:rPr>
+                <w:rFonts w:ascii="Consolas" w:hAnsi="Consolas" w:eastAsia="Consolas"/>
+                <w:sz w:val="16"/>
+              </w:rPr>
+              <w:t>ModuleNotFoundError: domain</w:t>
+            </w:r>
+            <w:r>
+              <w:rPr>
+                <w:sz w:val="16"/>
+              </w:rPr>
+              <w:t>)</w:t>
             </w:r>
           </w:p>
         </w:tc>
@@ -10924,7 +11798,7 @@
               <w:rPr>
                 <w:sz w:val="16"/>
               </w:rPr>
-              <w:t>El servicio llama al puerto antes de que el dominio valide el estado</w:t>
+              <w:t>El paquete no incluía el código del PIA que las pruebas importan</w:t>
             </w:r>
           </w:p>
         </w:tc>
@@ -10942,20 +11816,33 @@
               <w:rPr>
                 <w:sz w:val="16"/>
               </w:rPr>
-              <w:t xml:space="preserve">Hallazgo documentado con </w:t>
+              <w:t xml:space="preserve">Código real incluido; </w:t>
             </w:r>
             <w:r>
               <w:rPr>
                 <w:rFonts w:ascii="Consolas" w:hAnsi="Consolas" w:eastAsia="Consolas"/>
-                <w:sz w:val="18"/>
-              </w:rPr>
-              <w:t>xfail</w:t>
-            </w:r>
-            <w:r>
-              <w:rPr>
                 <w:sz w:val="16"/>
               </w:rPr>
-              <w:t>; corrección propuesta, no aplicada</w:t>
+              <w:t>conftest.py</w:t>
+            </w:r>
+            <w:r>
+              <w:rPr>
+                <w:sz w:val="16"/>
+              </w:rPr>
+              <w:t xml:space="preserve"> con mensaje claro; </w:t>
+            </w:r>
+            <w:r>
+              <w:rPr>
+                <w:rFonts w:ascii="Consolas" w:hAnsi="Consolas" w:eastAsia="Consolas"/>
+                <w:sz w:val="16"/>
+              </w:rPr>
+              <w:t>pytest.ini</w:t>
+            </w:r>
+            <w:r>
+              <w:rPr>
+                <w:sz w:val="16"/>
+              </w:rPr>
+              <w:t xml:space="preserve"> (28/10)</w:t>
             </w:r>
           </w:p>
         </w:tc>
@@ -10978,7 +11865,7 @@
               <w:rPr>
                 <w:sz w:val="16"/>
               </w:rPr>
-              <w:t>U5-O1</w:t>
+              <w:t>I-07</w:t>
             </w:r>
           </w:p>
         </w:tc>
@@ -10994,9 +11881,16 @@
             <w:r/>
             <w:r>
               <w:rPr>
+                <w:rFonts w:ascii="Consolas" w:hAnsi="Consolas" w:eastAsia="Consolas"/>
                 <w:sz w:val="16"/>
               </w:rPr>
-              <w:t>Días naturales por fecha o por 24 h</w:t>
+              <w:t>test_trazabilidad_api</w:t>
+            </w:r>
+            <w:r>
+              <w:rPr>
+                <w:sz w:val="16"/>
+              </w:rPr>
+              <w:t xml:space="preserve"> falló tras la primera versión de la corrección U5-H1</w:t>
             </w:r>
           </w:p>
         </w:tc>
@@ -11014,7 +11908,7 @@
               <w:rPr>
                 <w:sz w:val="16"/>
               </w:rPr>
-              <w:t>Los documentos no lo precisan; el código usa fechas de calendario</w:t>
+              <w:t>Un comentario citaba «CA-083» y el generador de trazabilidad lo tomó</w:t>
             </w:r>
           </w:p>
         </w:tc>
@@ -11032,7 +11926,7 @@
               <w:rPr>
                 <w:sz w:val="16"/>
               </w:rPr>
-              <w:t>Ambigüedad registrada (PIA-02)</w:t>
+              <w:t>Se retiró la cita; la prueba pasa (28/10)</w:t>
             </w:r>
           </w:p>
         </w:tc>
@@ -11047,6 +11941,7 @@
           </w:tcPr>
           <w:p>
             <w:pPr>
+              <w:keepNext/>
               <w:spacing w:after="20"/>
             </w:pPr>
             <w:r/>
@@ -11054,6 +11949,159 @@
               <w:rPr>
                 <w:sz w:val="16"/>
               </w:rPr>
+              <w:t>U5-H1</w:t>
+            </w:r>
+          </w:p>
+        </w:tc>
+        <w:tc>
+          <w:tcPr>
+            <w:tcW w:type="dxa" w:w="2608"/>
+          </w:tcPr>
+          <w:p>
+            <w:pPr>
+              <w:keepNext/>
+              <w:spacing w:after="20"/>
+            </w:pPr>
+            <w:r/>
+            <w:r>
+              <w:rPr>
+                <w:sz w:val="16"/>
+              </w:rPr>
+              <w:t>Se consultaba a proveedores con una solicitud ya No procedente</w:t>
+            </w:r>
+          </w:p>
+        </w:tc>
+        <w:tc>
+          <w:tcPr>
+            <w:tcW w:type="dxa" w:w="3175"/>
+          </w:tcPr>
+          <w:p>
+            <w:pPr>
+              <w:keepNext/>
+              <w:spacing w:after="20"/>
+            </w:pPr>
+            <w:r/>
+            <w:r>
+              <w:rPr>
+                <w:sz w:val="16"/>
+              </w:rPr>
+              <w:t>El servicio llamaba al puerto antes de que el dominio validara el estado</w:t>
+            </w:r>
+          </w:p>
+        </w:tc>
+        <w:tc>
+          <w:tcPr>
+            <w:tcW w:type="dxa" w:w="3231"/>
+          </w:tcPr>
+          <w:p>
+            <w:pPr>
+              <w:keepNext/>
+              <w:spacing w:after="20"/>
+            </w:pPr>
+            <w:r/>
+            <w:r>
+              <w:rPr>
+                <w:sz w:val="16"/>
+              </w:rPr>
+              <w:t>Corregido en la copia (RED → GREEN, 28/10); parche pendiente de aprobación del equipo</w:t>
+            </w:r>
+          </w:p>
+        </w:tc>
+      </w:tr>
+      <w:tr>
+        <w:trPr>
+          <w:cantSplit w:val="true"/>
+        </w:trPr>
+        <w:tc>
+          <w:tcPr>
+            <w:tcW w:type="dxa" w:w="850"/>
+          </w:tcPr>
+          <w:p>
+            <w:pPr>
+              <w:keepNext/>
+              <w:spacing w:after="20"/>
+            </w:pPr>
+            <w:r/>
+            <w:r>
+              <w:rPr>
+                <w:sz w:val="16"/>
+              </w:rPr>
+              <w:t>U5-O1</w:t>
+            </w:r>
+          </w:p>
+        </w:tc>
+        <w:tc>
+          <w:tcPr>
+            <w:tcW w:type="dxa" w:w="2608"/>
+          </w:tcPr>
+          <w:p>
+            <w:pPr>
+              <w:keepNext/>
+              <w:spacing w:after="20"/>
+            </w:pPr>
+            <w:r/>
+            <w:r>
+              <w:rPr>
+                <w:sz w:val="16"/>
+              </w:rPr>
+              <w:t>Días naturales por fecha o por 24 h</w:t>
+            </w:r>
+          </w:p>
+        </w:tc>
+        <w:tc>
+          <w:tcPr>
+            <w:tcW w:type="dxa" w:w="3175"/>
+          </w:tcPr>
+          <w:p>
+            <w:pPr>
+              <w:keepNext/>
+              <w:spacing w:after="20"/>
+            </w:pPr>
+            <w:r/>
+            <w:r>
+              <w:rPr>
+                <w:sz w:val="16"/>
+              </w:rPr>
+              <w:t>Los documentos no lo precisan; el código usa fechas de calendario</w:t>
+            </w:r>
+          </w:p>
+        </w:tc>
+        <w:tc>
+          <w:tcPr>
+            <w:tcW w:type="dxa" w:w="3231"/>
+          </w:tcPr>
+          <w:p>
+            <w:pPr>
+              <w:keepNext/>
+              <w:spacing w:after="20"/>
+            </w:pPr>
+            <w:r/>
+            <w:r>
+              <w:rPr>
+                <w:sz w:val="16"/>
+              </w:rPr>
+              <w:t>Ambigüedad registrada (PIA-02)</w:t>
+            </w:r>
+          </w:p>
+        </w:tc>
+      </w:tr>
+      <w:tr>
+        <w:trPr>
+          <w:cantSplit w:val="true"/>
+        </w:trPr>
+        <w:tc>
+          <w:tcPr>
+            <w:tcW w:type="dxa" w:w="850"/>
+          </w:tcPr>
+          <w:p>
+            <w:pPr>
+              <w:spacing w:after="20"/>
+            </w:pPr>
+            <w:r/>
+            <w:r>
+              <w:rPr>
+                <w:sz w:val="16"/>
+              </w:rPr>
               <w:t>E8</w:t>
             </w:r>
           </w:p>
@@ -11105,7 +12153,7 @@
               <w:rPr>
                 <w:sz w:val="16"/>
               </w:rPr>
-              <w:t>Pendiente del equipo</w:t>
+              <w:t>Pendiente del equipo (guía de pendientes, P-03)</w:t>
             </w:r>
           </w:p>
         </w:tc>
@@ -11338,17 +12386,27 @@
         <w:jc w:val="both"/>
       </w:pPr>
       <w:r>
-        <w:t xml:space="preserve">Completamos las pruebas del laboratorio con 69 aprobadas, 1 riesgo documentado, Ruff sin errores y 100 % de cobertura de líneas y ramas; aplicamos TDD con evidencia real de RED y GREEN y dejamos un workflow validado. En Eventos Nova probamos cuatro reglas aprobadas sobre el código real, incluida persistencia en PostgreSQL y dobles de los servicios externos, y encontramos un hallazgo y una ambigüedad que no aparecían en la suite existente. Lo que falta es externo a este entorno: las ejecuciones de GitHub Actions y la integración de </w:t>
+        <w:t xml:space="preserve">Completamos las pruebas del laboratorio con 69 aprobadas, 1 riesgo documentado, Ruff sin errores y 100 % de cobertura de líneas y ramas; aplicamos TDD con evidencia real de RED y GREEN y dejamos un workflow validado. En Eventos Nova probamos cuatro reglas aprobadas sobre el código real, incluida persistencia en PostgreSQL y dobles de los servicios externos: 22 pruebas aprobadas tras corregir el hallazgo U5-H1 en una copia del código, y una ambigüedad registrada. La revisión del 28/10 también mostró que un paquete reproducible debe incluir lo que sus pruebas importan. Lo que falta depende del equipo y está detallado en </w:t>
       </w:r>
       <w:r>
         <w:rPr>
           <w:rFonts w:ascii="Consolas" w:hAnsi="Consolas" w:eastAsia="Consolas"/>
           <w:sz w:val="18"/>
         </w:rPr>
+        <w:t>docs/GUIA_PENDIENTES_ACTIVIDAD5.docx</w:t>
+      </w:r>
+      <w:r>
+        <w:t xml:space="preserve">: las ejecuciones de GitHub Actions, la integración de </w:t>
+      </w:r>
+      <w:r>
+        <w:rPr>
+          <w:rFonts w:ascii="Consolas" w:hAnsi="Consolas" w:eastAsia="Consolas"/>
+          <w:sz w:val="18"/>
+        </w:rPr>
         <w:t>tests_u5</w:t>
       </w:r>
       <w:r>
-        <w:t xml:space="preserve"> en el repositorio del equipo.</w:t>
+        <w:t xml:space="preserve"> y del parche en el repositorio del PIA y la revisión de la bitácora por cada integrante.</w:t>
       </w:r>
     </w:p>
     <w:p>
@@ -11435,7 +12493,7 @@
         <w:t>Pendiente.</w:t>
       </w:r>
       <w:r>
-        <w:t xml:space="preserve"> El repositorio local está listo, con historial de commits, workflow y README. La URL se anotará cuando el equipo lo publique y ejecute las tres corridas de E8. El repositorio de Eventos Nova tampoco tiene remoto configurado.</w:t>
+        <w:t xml:space="preserve"> El repositorio local está listo, con historial de commits, workflow y README. La URL se anotará cuando el equipo lo publique y ejecute las tres corridas de E8 (pasos en la guía de pendientes, P-03). El repositorio de Eventos Nova tampoco tiene remoto configurado.</w:t>
       </w:r>
     </w:p>
     <w:p>
@@ -15158,7 +16216,7 @@
               <w:rPr>
                 <w:sz w:val="15"/>
               </w:rPr>
-              <w:t>Error (riesgo documentado)</w:t>
+              <w:t>Riesgo documentado</w:t>
             </w:r>
           </w:p>
         </w:tc>
@@ -15927,7 +16985,7 @@
               <w:rPr>
                 <w:sz w:val="14"/>
               </w:rPr>
-              <w:t>Se rechaza y NO se consulta a proveedores</w:t>
+              <w:t>Se rechaza con el mismo mensaje de antes y NO se consulta a proveedores (hallazgo U5-H1, corregido el 28/10/2026)</w:t>
             </w:r>
           </w:p>
         </w:tc>
@@ -15944,7 +17002,7 @@
               <w:rPr>
                 <w:sz w:val="14"/>
               </w:rPr>
-              <w:t>Error (hallazgo U5-H1)</w:t>
+              <w:t>Error</w:t>
             </w:r>
           </w:p>
         </w:tc>
@@ -15961,7 +17019,7 @@
               <w:rPr>
                 <w:sz w:val="14"/>
               </w:rPr>
-              <w:t>XFAIL</w:t>
+              <w:t>PASSED</w:t>
             </w:r>
           </w:p>
         </w:tc>
@@ -18341,7 +19399,7 @@
               <w:rPr>
                 <w:sz w:val="14"/>
               </w:rPr>
-              <w:t>Error → Éxito</w:t>
+              <w:t>Error</w:t>
             </w:r>
           </w:p>
         </w:tc>
@@ -18586,7 +19644,7 @@
           <w:rFonts w:ascii="Consolas" w:hAnsi="Consolas" w:eastAsia="Consolas"/>
           <w:sz w:val="17"/>
         </w:rPr>
-        <w:t># Eventos Nova: copiar pia_eventos_nova/tests_u5/ a la raíz del repositorio del equipo</w:t>
+        <w:t># Eventos Nova: copia del repositorio del equipo con tests_u5 integradas</w:t>
         <w:br/>
       </w:r>
       <w:r>
@@ -18594,6 +19652,14 @@
           <w:rFonts w:ascii="Consolas" w:hAnsi="Consolas" w:eastAsia="Consolas"/>
           <w:sz w:val="17"/>
         </w:rPr>
+        <w:t>cd pia_eventos_nova/Eventosnova</w:t>
+        <w:br/>
+      </w:r>
+      <w:r>
+        <w:rPr>
+          <w:rFonts w:ascii="Consolas" w:hAnsi="Consolas" w:eastAsia="Consolas"/>
+          <w:sz w:val="17"/>
+        </w:rPr>
         <w:t>python -m pip install -r requirements-dev.txt "pytest&gt;=8,&lt;10" "pytest-cov&gt;=5,&lt;8"</w:t>
         <w:br/>
       </w:r>
@@ -18602,7 +19668,15 @@
           <w:rFonts w:ascii="Consolas" w:hAnsi="Consolas" w:eastAsia="Consolas"/>
           <w:sz w:val="17"/>
         </w:rPr>
-        <w:t>python -m pytest tests_u5 -v -rxX                       # PostgreSQL de pruebas opcional: TEST_DATABASE_URL</w:t>
+        <w:t>python -m pytest -v -rxX                                # pytest.ini: recoge tests_u5; PostgreSQL opcional (TEST_DATABASE_URL)</w:t>
+        <w:br/>
+      </w:r>
+      <w:r>
+        <w:rPr>
+          <w:rFonts w:ascii="Consolas" w:hAnsi="Consolas" w:eastAsia="Consolas"/>
+          <w:sz w:val="17"/>
+        </w:rPr>
+        <w:t>python -m unittest discover -s tests                    # suite propia del equipo</w:t>
       </w:r>
     </w:p>
     <w:sectPr>

</xml_diff>